<commit_message>
Add technical handoff doc, update quick start guide, add Vercel to gitignore
Co-Authored-By: Claude Sonnet 4.6 <noreply@anthropic.com>
</commit_message>
<xml_diff>
--- a/SWK_Simulator_Quick_Start_Guide.docx
+++ b/SWK_Simulator_Quick_Start_Guide.docx
@@ -1,13 +1,13 @@
 
 <file path=word/document.xml><?xml version="1.0" encoding="utf-8"?>
-<w:document xmlns:w="http://schemas.openxmlformats.org/wordprocessingml/2006/main" xmlns:m="http://schemas.openxmlformats.org/officeDocument/2006/math" xmlns:r="http://schemas.openxmlformats.org/officeDocument/2006/relationships" xmlns:o="urn:schemas-microsoft-com:office:office" xmlns:v="urn:schemas-microsoft-com:vml" xmlns:w10="urn:schemas-microsoft-com:office:word" xmlns:a="http://schemas.openxmlformats.org/drawingml/2006/main" xmlns:pic="http://schemas.openxmlformats.org/drawingml/2006/picture" xmlns:wp="http://schemas.openxmlformats.org/drawingml/2006/wordprocessingDrawing">
+<w:document xmlns:wpc="http://schemas.microsoft.com/office/word/2010/wordprocessingCanvas" xmlns:cx="http://schemas.microsoft.com/office/drawing/2014/chartex" xmlns:cx1="http://schemas.microsoft.com/office/drawing/2015/9/8/chartex" xmlns:cx2="http://schemas.microsoft.com/office/drawing/2015/10/21/chartex" xmlns:cx3="http://schemas.microsoft.com/office/drawing/2016/5/9/chartex" xmlns:cx4="http://schemas.microsoft.com/office/drawing/2016/5/10/chartex" xmlns:cx5="http://schemas.microsoft.com/office/drawing/2016/5/11/chartex" xmlns:cx6="http://schemas.microsoft.com/office/drawing/2016/5/12/chartex" xmlns:cx7="http://schemas.microsoft.com/office/drawing/2016/5/13/chartex" xmlns:cx8="http://schemas.microsoft.com/office/drawing/2016/5/14/chartex" xmlns:mc="http://schemas.openxmlformats.org/markup-compatibility/2006" xmlns:aink="http://schemas.microsoft.com/office/drawing/2016/ink" xmlns:am3d="http://schemas.microsoft.com/office/drawing/2017/model3d" xmlns:o="urn:schemas-microsoft-com:office:office" xmlns:oel="http://schemas.microsoft.com/office/2019/extlst" xmlns:r="http://schemas.openxmlformats.org/officeDocument/2006/relationships" xmlns:m="http://schemas.openxmlformats.org/officeDocument/2006/math" xmlns:v="urn:schemas-microsoft-com:vml" xmlns:wp14="http://schemas.microsoft.com/office/word/2010/wordprocessingDrawing" xmlns:wp="http://schemas.openxmlformats.org/drawingml/2006/wordprocessingDrawing" xmlns:w10="urn:schemas-microsoft-com:office:word" xmlns:w="http://schemas.openxmlformats.org/wordprocessingml/2006/main" xmlns:w14="http://schemas.microsoft.com/office/word/2010/wordml" xmlns:w15="http://schemas.microsoft.com/office/word/2012/wordml" xmlns:w16cex="http://schemas.microsoft.com/office/word/2018/wordml/cex" xmlns:w16cid="http://schemas.microsoft.com/office/word/2016/wordml/cid" xmlns:w16="http://schemas.microsoft.com/office/word/2018/wordml" xmlns:w16du="http://schemas.microsoft.com/office/word/2023/wordml/word16du" xmlns:w16sdtdh="http://schemas.microsoft.com/office/word/2020/wordml/sdtdatahash" xmlns:w16sdtfl="http://schemas.microsoft.com/office/word/2024/wordml/sdtformatlock" xmlns:w16se="http://schemas.microsoft.com/office/word/2015/wordml/symex" xmlns:wpg="http://schemas.microsoft.com/office/word/2010/wordprocessingGroup" xmlns:wpi="http://schemas.microsoft.com/office/word/2010/wordprocessingInk" xmlns:wne="http://schemas.microsoft.com/office/word/2006/wordml" xmlns:wps="http://schemas.microsoft.com/office/word/2010/wordprocessingShape" mc:Ignorable="w14 w15 w16se w16cid w16 w16cex w16sdtdh w16sdtfl w16du wp14">
   <w:body>
     <w:p>
       <w:pPr>
         <w:pStyle w:val="Title"/>
       </w:pPr>
       <w:r>
-        <w:t xml:space="preserve">Client Engagement Practice Simulator</w:t>
+        <w:t>Client Engagement Practice Simulator</w:t>
       </w:r>
     </w:p>
     <w:p>
@@ -15,7 +15,7 @@
         <w:pStyle w:val="Subtitle"/>
       </w:pPr>
       <w:r>
-        <w:t xml:space="preserve">Quick Start Guide — SWK3103 / SWK2113 Generalist Practice</w:t>
+        <w:t>Quick Start Guide — SWK3103 Generalist Practice</w:t>
       </w:r>
     </w:p>
     <w:p>
@@ -23,25 +23,25 @@
         <w:pStyle w:val="Date"/>
       </w:pPr>
       <w:r>
-        <w:t xml:space="preserve">University of Oklahoma — College of Professional and Continuing Studies</w:t>
-      </w:r>
-    </w:p>
-    <w:bookmarkStart w:id="17" w:name="for-students"/>
+        <w:t>University of Oklahoma — College of Professional and Continuing Studies</w:t>
+      </w:r>
+    </w:p>
     <w:p>
       <w:pPr>
         <w:pStyle w:val="Heading1"/>
       </w:pPr>
-      <w:r>
-        <w:t xml:space="preserve">For Students</w:t>
-      </w:r>
-    </w:p>
-    <w:bookmarkStart w:id="9" w:name="what-this-is"/>
+      <w:bookmarkStart w:id="0" w:name="for-students"/>
+      <w:r>
+        <w:t>For Students</w:t>
+      </w:r>
+    </w:p>
     <w:p>
       <w:pPr>
         <w:pStyle w:val="Heading2"/>
       </w:pPr>
-      <w:r>
-        <w:t xml:space="preserve">What This Is</w:t>
+      <w:bookmarkStart w:id="1" w:name="what-this-is"/>
+      <w:r>
+        <w:t>What This Is</w:t>
       </w:r>
     </w:p>
     <w:p>
@@ -49,7 +49,7 @@
         <w:pStyle w:val="FirstParagraph"/>
       </w:pPr>
       <w:r>
-        <w:t xml:space="preserve">The Client Engagement Practice Simulator lets you practice an informed consent session with a simulated client before doing it in a real setting. You choose a client scenario, conduct a 20-minute interview, hear honest feedback from the client, then receive a rubric-based performance assessment.</w:t>
+        <w:t>The Client Engagement Practice Simulator lets you practice an informed consent session with a simulated client before doing it in a real setting. You choose a client scenario, conduct a 20-minute interview, hear honest feedback from the client, then receive a rubric-based performance assessment.</w:t>
       </w:r>
     </w:p>
     <w:p>
@@ -57,24 +57,27 @@
         <w:pStyle w:val="BodyText"/>
       </w:pPr>
       <w:r>
-        <w:t xml:space="preserve">There is no penalty for mistakes here — that is the point. Try different approaches, pay attention to how your client responds to your tone and phrasing, and use the reflection time to notice what worked and what did not.</w:t>
-      </w:r>
-    </w:p>
-    <w:p>
-      <w:r>
-        <w:pict>
-          <v:rect style="width:0;height:1.5pt" o:hralign="center" o:hrstd="t" o:hr="t"/>
+        <w:t>There is no penalty for mistakes here — that is the point. Try different approaches, pay attention to how your client responds to your tone and phrasing, and use the reflection time to notice what worked and what did not.</w:t>
+      </w:r>
+    </w:p>
+    <w:p>
+      <w:r>
+        <w:rPr>
+          <w:noProof/>
+        </w:rPr>
+        <w:pict w14:anchorId="2891D953">
+          <v:rect id="_x0000_i1037" alt="" style="width:468pt;height:.05pt;mso-width-percent:0;mso-height-percent:0;mso-width-percent:0;mso-height-percent:0" o:hralign="center" o:hrstd="t" o:hr="t"/>
         </w:pict>
       </w:r>
     </w:p>
-    <w:bookmarkEnd w:id="9"/>
-    <w:bookmarkStart w:id="10" w:name="step-1-choose-your-client"/>
     <w:p>
       <w:pPr>
         <w:pStyle w:val="Heading2"/>
       </w:pPr>
-      <w:r>
-        <w:t xml:space="preserve">Step 1 — Choose Your Client</w:t>
+      <w:bookmarkStart w:id="2" w:name="step-1-choose-your-client"/>
+      <w:bookmarkEnd w:id="1"/>
+      <w:r>
+        <w:t>Step 1 — Choose Your Client</w:t>
       </w:r>
     </w:p>
     <w:p>
@@ -82,7 +85,7 @@
         <w:pStyle w:val="FirstParagraph"/>
       </w:pPr>
       <w:r>
-        <w:t xml:space="preserve">When you open the app, you will see four client profiles:</w:t>
+        <w:t>When you open the app, you will see four client profiles:</w:t>
       </w:r>
     </w:p>
     <w:p>
@@ -90,7 +93,7 @@
         <w:pStyle w:val="Compact"/>
         <w:numPr>
           <w:ilvl w:val="0"/>
-          <w:numId w:val="1001"/>
+          <w:numId w:val="2"/>
         </w:numPr>
       </w:pPr>
       <w:r>
@@ -98,13 +101,10 @@
           <w:b/>
           <w:bCs/>
         </w:rPr>
-        <w:t xml:space="preserve">Standard Scenarios</w:t>
-      </w:r>
-      <w:r>
-        <w:t xml:space="preserve"> </w:t>
-      </w:r>
-      <w:r>
-        <w:t xml:space="preserve">(Michelle, David) — Build core skills in a straightforward first-session context.</w:t>
+        <w:t>Standard Scenarios</w:t>
+      </w:r>
+      <w:r>
+        <w:t xml:space="preserve"> (Michelle, David) — Build core skills in a straightforward first-session context.</w:t>
       </w:r>
     </w:p>
     <w:p>
@@ -112,7 +112,7 @@
         <w:pStyle w:val="Compact"/>
         <w:numPr>
           <w:ilvl w:val="0"/>
-          <w:numId w:val="1001"/>
+          <w:numId w:val="2"/>
         </w:numPr>
       </w:pPr>
       <w:r>
@@ -120,13 +120,10 @@
           <w:b/>
           <w:bCs/>
         </w:rPr>
-        <w:t xml:space="preserve">Advanced Scenarios</w:t>
-      </w:r>
-      <w:r>
-        <w:t xml:space="preserve"> </w:t>
-      </w:r>
-      <w:r>
-        <w:t xml:space="preserve">(Carlos, Aisha) — More complex presenting situations that require careful attention to tone and pacing.</w:t>
+        <w:t>Advanced Scenarios</w:t>
+      </w:r>
+      <w:r>
+        <w:t xml:space="preserve"> (Carlos, Aisha) — More complex presenting situations that require careful attention to tone and pacing.</w:t>
       </w:r>
     </w:p>
     <w:p>
@@ -138,40 +135,40 @@
           <w:b/>
           <w:bCs/>
         </w:rPr>
-        <w:t xml:space="preserve">Select a client card</w:t>
-      </w:r>
-      <w:r>
-        <w:t xml:space="preserve">, then click</w:t>
-      </w:r>
-      <w:r>
-        <w:t xml:space="preserve"> </w:t>
+        <w:t>Select a client card</w:t>
+      </w:r>
+      <w:r>
+        <w:t xml:space="preserve">, then click </w:t>
       </w:r>
       <w:r>
         <w:rPr>
           <w:b/>
           <w:bCs/>
         </w:rPr>
-        <w:t xml:space="preserve">Continue to Case Brief</w:t>
-      </w:r>
-      <w:r>
-        <w:t xml:space="preserve">.</w:t>
-      </w:r>
-    </w:p>
-    <w:p>
-      <w:r>
-        <w:pict>
-          <v:rect style="width:0;height:1.5pt" o:hralign="center" o:hrstd="t" o:hr="t"/>
+        <w:t>Continue to Case Brief</w:t>
+      </w:r>
+      <w:r>
+        <w:t>.</w:t>
+      </w:r>
+    </w:p>
+    <w:p>
+      <w:r>
+        <w:rPr>
+          <w:noProof/>
+        </w:rPr>
+        <w:pict w14:anchorId="0976695B">
+          <v:rect id="_x0000_i1036" alt="" style="width:468pt;height:.05pt;mso-width-percent:0;mso-height-percent:0;mso-width-percent:0;mso-height-percent:0" o:hralign="center" o:hrstd="t" o:hr="t"/>
         </w:pict>
       </w:r>
     </w:p>
-    <w:bookmarkEnd w:id="10"/>
-    <w:bookmarkStart w:id="11" w:name="step-2-review-the-case-brief"/>
     <w:p>
       <w:pPr>
         <w:pStyle w:val="Heading2"/>
       </w:pPr>
-      <w:r>
-        <w:t xml:space="preserve">Step 2 — Review the Case Brief</w:t>
+      <w:bookmarkStart w:id="3" w:name="step-2-review-the-case-brief"/>
+      <w:bookmarkEnd w:id="2"/>
+      <w:r>
+        <w:t>Step 2 — Review the Case Brief</w:t>
       </w:r>
     </w:p>
     <w:p>
@@ -179,39 +176,27 @@
         <w:pStyle w:val="FirstParagraph"/>
       </w:pPr>
       <w:r>
-        <w:t xml:space="preserve">Read your client’s background information before the interview begins. You can also expand the</w:t>
-      </w:r>
-      <w:r>
-        <w:t xml:space="preserve"> </w:t>
+        <w:t xml:space="preserve">Read your client’s background information before the interview begins. You can also expand the </w:t>
       </w:r>
       <w:r>
         <w:rPr>
           <w:b/>
           <w:bCs/>
         </w:rPr>
-        <w:t xml:space="preserve">Informed Consent</w:t>
-      </w:r>
-      <w:r>
-        <w:t xml:space="preserve"> </w:t>
-      </w:r>
-      <w:r>
-        <w:t xml:space="preserve">and</w:t>
-      </w:r>
-      <w:r>
-        <w:t xml:space="preserve"> </w:t>
+        <w:t>Informed Consent</w:t>
+      </w:r>
+      <w:r>
+        <w:t xml:space="preserve"> and </w:t>
       </w:r>
       <w:r>
         <w:rPr>
           <w:b/>
           <w:bCs/>
         </w:rPr>
-        <w:t xml:space="preserve">Agency Services</w:t>
-      </w:r>
-      <w:r>
-        <w:t xml:space="preserve"> </w:t>
-      </w:r>
-      <w:r>
-        <w:t xml:space="preserve">sections for reference — you will have access to these during the interview as well.</w:t>
+        <w:t>Agency Services</w:t>
+      </w:r>
+      <w:r>
+        <w:t xml:space="preserve"> sections for reference — you will have access to these during the interview as well.</w:t>
       </w:r>
     </w:p>
     <w:p>
@@ -219,40 +204,38 @@
         <w:pStyle w:val="BodyText"/>
       </w:pPr>
       <w:r>
-        <w:t xml:space="preserve">Click</w:t>
-      </w:r>
-      <w:r>
-        <w:t xml:space="preserve"> </w:t>
+        <w:t xml:space="preserve">Click </w:t>
       </w:r>
       <w:r>
         <w:rPr>
           <w:b/>
           <w:bCs/>
         </w:rPr>
-        <w:t xml:space="preserve">Continue to Interview Guide</w:t>
-      </w:r>
-      <w:r>
-        <w:t xml:space="preserve"> </w:t>
-      </w:r>
-      <w:r>
-        <w:t xml:space="preserve">when ready.</w:t>
-      </w:r>
-    </w:p>
-    <w:p>
-      <w:r>
-        <w:pict>
-          <v:rect style="width:0;height:1.5pt" o:hralign="center" o:hrstd="t" o:hr="t"/>
+        <w:t>Continue to Interview Guide</w:t>
+      </w:r>
+      <w:r>
+        <w:t xml:space="preserve"> when ready.</w:t>
+      </w:r>
+    </w:p>
+    <w:p>
+      <w:r>
+        <w:rPr>
+          <w:noProof/>
+        </w:rPr>
+        <w:pict w14:anchorId="2CACAE0D">
+          <v:rect id="_x0000_i1035" alt="" style="width:468pt;height:.05pt;mso-width-percent:0;mso-height-percent:0;mso-width-percent:0;mso-height-percent:0" o:hralign="center" o:hrstd="t" o:hr="t"/>
         </w:pict>
       </w:r>
     </w:p>
-    <w:bookmarkEnd w:id="11"/>
-    <w:bookmarkStart w:id="12" w:name="step-3-review-the-interview-guide"/>
     <w:p>
       <w:pPr>
         <w:pStyle w:val="Heading2"/>
       </w:pPr>
-      <w:r>
-        <w:t xml:space="preserve">Step 3 — Review the Interview Guide</w:t>
+      <w:bookmarkStart w:id="4" w:name="step-3-review-the-interview-guide"/>
+      <w:bookmarkEnd w:id="3"/>
+      <w:r>
+        <w:lastRenderedPageBreak/>
+        <w:t>Step 3 — Review the Interview Guide</w:t>
       </w:r>
     </w:p>
     <w:p>
@@ -260,7 +243,7 @@
         <w:pStyle w:val="FirstParagraph"/>
       </w:pPr>
       <w:r>
-        <w:t xml:space="preserve">The guide walks you through the six key tasks for a first session. Use it as a reference, not a script. Do not read items aloud to the client.</w:t>
+        <w:t>The guide walks you through the six key tasks for a first session. Use it as a reference, not a script. Do not read items aloud to the client.</w:t>
       </w:r>
     </w:p>
     <w:p>
@@ -268,40 +251,37 @@
         <w:pStyle w:val="BodyText"/>
       </w:pPr>
       <w:r>
-        <w:t xml:space="preserve">Click</w:t>
-      </w:r>
-      <w:r>
-        <w:t xml:space="preserve"> </w:t>
+        <w:t xml:space="preserve">Click </w:t>
       </w:r>
       <w:r>
         <w:rPr>
           <w:b/>
           <w:bCs/>
         </w:rPr>
-        <w:t xml:space="preserve">Begin Interview</w:t>
-      </w:r>
-      <w:r>
-        <w:t xml:space="preserve"> </w:t>
-      </w:r>
-      <w:r>
-        <w:t xml:space="preserve">when you are ready to start.</w:t>
-      </w:r>
-    </w:p>
-    <w:p>
-      <w:r>
-        <w:pict>
-          <v:rect style="width:0;height:1.5pt" o:hralign="center" o:hrstd="t" o:hr="t"/>
+        <w:t>Begin Interview</w:t>
+      </w:r>
+      <w:r>
+        <w:t xml:space="preserve"> when you are ready to start.</w:t>
+      </w:r>
+    </w:p>
+    <w:p>
+      <w:r>
+        <w:rPr>
+          <w:noProof/>
+        </w:rPr>
+        <w:pict w14:anchorId="1E1C58AC">
+          <v:rect id="_x0000_i1034" alt="" style="width:468pt;height:.05pt;mso-width-percent:0;mso-height-percent:0;mso-width-percent:0;mso-height-percent:0" o:hralign="center" o:hrstd="t" o:hr="t"/>
         </w:pict>
       </w:r>
     </w:p>
-    <w:bookmarkEnd w:id="12"/>
-    <w:bookmarkStart w:id="13" w:name="step-4-conduct-the-interview-20-minutes"/>
     <w:p>
       <w:pPr>
         <w:pStyle w:val="Heading2"/>
       </w:pPr>
-      <w:r>
-        <w:t xml:space="preserve">Step 4 — Conduct the Interview (20 minutes)</w:t>
+      <w:bookmarkStart w:id="5" w:name="step-4-conduct-the-interview-20-minutes"/>
+      <w:bookmarkEnd w:id="4"/>
+      <w:r>
+        <w:t>Step 4 — Conduct the Interview (20 minutes)</w:t>
       </w:r>
     </w:p>
     <w:p>
@@ -309,7 +289,7 @@
         <w:pStyle w:val="FirstParagraph"/>
       </w:pPr>
       <w:r>
-        <w:t xml:space="preserve">The timer starts with your first message. You have two ways to communicate:</w:t>
+        <w:t>The timer starts with your first message. You have two ways to communicate:</w:t>
       </w:r>
     </w:p>
     <w:p>
@@ -321,29 +301,20 @@
           <w:b/>
           <w:bCs/>
         </w:rPr>
-        <w:t xml:space="preserve">Text input:</w:t>
-      </w:r>
-      <w:r>
-        <w:t xml:space="preserve"> </w:t>
-      </w:r>
-      <w:r>
-        <w:t xml:space="preserve">Type in the message box and press</w:t>
-      </w:r>
-      <w:r>
-        <w:t xml:space="preserve"> </w:t>
+        <w:t>Text input:</w:t>
+      </w:r>
+      <w:r>
+        <w:t xml:space="preserve"> Type in the message box and press </w:t>
       </w:r>
       <w:r>
         <w:rPr>
           <w:b/>
           <w:bCs/>
         </w:rPr>
-        <w:t xml:space="preserve">Enter</w:t>
-      </w:r>
-      <w:r>
-        <w:t xml:space="preserve"> </w:t>
-      </w:r>
-      <w:r>
-        <w:t xml:space="preserve">or click the send button.</w:t>
+        <w:t>Enter</w:t>
+      </w:r>
+      <w:r>
+        <w:t xml:space="preserve"> or click the send button.</w:t>
       </w:r>
     </w:p>
     <w:p>
@@ -355,29 +326,20 @@
           <w:b/>
           <w:bCs/>
         </w:rPr>
-        <w:t xml:space="preserve">Voice input:</w:t>
-      </w:r>
-      <w:r>
-        <w:t xml:space="preserve"> </w:t>
-      </w:r>
-      <w:r>
-        <w:t xml:space="preserve">Press and</w:t>
-      </w:r>
-      <w:r>
-        <w:t xml:space="preserve"> </w:t>
+        <w:t>Voice input:</w:t>
+      </w:r>
+      <w:r>
+        <w:t xml:space="preserve"> Press and </w:t>
       </w:r>
       <w:r>
         <w:rPr>
           <w:b/>
           <w:bCs/>
         </w:rPr>
-        <w:t xml:space="preserve">hold</w:t>
-      </w:r>
-      <w:r>
-        <w:t xml:space="preserve"> </w:t>
-      </w:r>
-      <w:r>
-        <w:t xml:space="preserve">the microphone button while speaking. Release when done. Your words will appear as text so you can review and edit before sending.</w:t>
+        <w:t>hold</w:t>
+      </w:r>
+      <w:r>
+        <w:t xml:space="preserve"> the microphone button while speaking. Release when done. Your words will appear as text so you can review and edit before sending.</w:t>
       </w:r>
     </w:p>
     <w:p>
@@ -389,13 +351,10 @@
           <w:b/>
           <w:bCs/>
         </w:rPr>
-        <w:t xml:space="preserve">Voice tip:</w:t>
-      </w:r>
-      <w:r>
-        <w:t xml:space="preserve"> </w:t>
-      </w:r>
-      <w:r>
-        <w:t xml:space="preserve">You may be prompted to allow microphone access the first time. The button stays active as long as you hold it — if the browser pauses between sentences, keep holding and it will resume.</w:t>
+        <w:t>Voice tip:</w:t>
+      </w:r>
+      <w:r>
+        <w:t xml:space="preserve"> You may be prompted to allow microphone access the first time. The button stays active as long as you hold it — if the browser pauses between sentences, keep holding and it will resume.</w:t>
       </w:r>
     </w:p>
     <w:p>
@@ -403,23 +362,17 @@
         <w:pStyle w:val="FirstParagraph"/>
       </w:pPr>
       <w:r>
-        <w:t xml:space="preserve">The</w:t>
-      </w:r>
-      <w:r>
-        <w:t xml:space="preserve"> </w:t>
+        <w:t xml:space="preserve">The </w:t>
       </w:r>
       <w:r>
         <w:rPr>
           <w:b/>
           <w:bCs/>
         </w:rPr>
-        <w:t xml:space="preserve">reference panel</w:t>
-      </w:r>
-      <w:r>
-        <w:t xml:space="preserve"> </w:t>
-      </w:r>
-      <w:r>
-        <w:t xml:space="preserve">on the right side of the screen (desktop) gives you access to the Interview Guide, the Informed Consent text, and Agency Services information at any time.</w:t>
+        <w:t>reference panel</w:t>
+      </w:r>
+      <w:r>
+        <w:t xml:space="preserve"> on the right side of the screen (desktop) gives you access to the Interview Guide, the Informed Consent text, and Agency Services information at any time.</w:t>
       </w:r>
     </w:p>
     <w:p>
@@ -427,40 +380,37 @@
         <w:pStyle w:val="BodyText"/>
       </w:pPr>
       <w:r>
-        <w:t xml:space="preserve">Click</w:t>
-      </w:r>
-      <w:r>
-        <w:t xml:space="preserve"> </w:t>
+        <w:t xml:space="preserve">Click </w:t>
       </w:r>
       <w:r>
         <w:rPr>
           <w:b/>
           <w:bCs/>
         </w:rPr>
-        <w:t xml:space="preserve">End Interview</w:t>
-      </w:r>
-      <w:r>
-        <w:t xml:space="preserve"> </w:t>
-      </w:r>
-      <w:r>
-        <w:t xml:space="preserve">when finished, or wait for the timer to reach zero.</w:t>
-      </w:r>
-    </w:p>
-    <w:p>
-      <w:r>
-        <w:pict>
-          <v:rect style="width:0;height:1.5pt" o:hralign="center" o:hrstd="t" o:hr="t"/>
+        <w:t>End Interview</w:t>
+      </w:r>
+      <w:r>
+        <w:t xml:space="preserve"> when finished, or wait for the timer to reach zero.</w:t>
+      </w:r>
+    </w:p>
+    <w:p>
+      <w:r>
+        <w:rPr>
+          <w:noProof/>
+        </w:rPr>
+        <w:pict w14:anchorId="19F7AFEB">
+          <v:rect id="_x0000_i1033" alt="" style="width:468pt;height:.05pt;mso-width-percent:0;mso-height-percent:0;mso-width-percent:0;mso-height-percent:0" o:hralign="center" o:hrstd="t" o:hr="t"/>
         </w:pict>
       </w:r>
     </w:p>
-    <w:bookmarkEnd w:id="13"/>
-    <w:bookmarkStart w:id="14" w:name="step-5-client-reflection-5-minutes"/>
     <w:p>
       <w:pPr>
         <w:pStyle w:val="Heading2"/>
       </w:pPr>
-      <w:r>
-        <w:t xml:space="preserve">Step 5 — Client Reflection (5 minutes)</w:t>
+      <w:bookmarkStart w:id="6" w:name="step-5-client-reflection-5-minutes"/>
+      <w:bookmarkEnd w:id="5"/>
+      <w:r>
+        <w:t>Step 5 — Client Reflection (5 minutes)</w:t>
       </w:r>
     </w:p>
     <w:p>
@@ -468,7 +418,7 @@
         <w:pStyle w:val="FirstParagraph"/>
       </w:pPr>
       <w:r>
-        <w:t xml:space="preserve">After the interview, your client shares honest feedback about how the experience felt from their side. This is not an evaluation — it is their perspective.</w:t>
+        <w:t>After the interview, your client shares honest feedback about how the experience felt from their side. This is not an evaluation — it is their perspective.</w:t>
       </w:r>
     </w:p>
     <w:p>
@@ -476,7 +426,7 @@
         <w:pStyle w:val="BodyText"/>
       </w:pPr>
       <w:r>
-        <w:t xml:space="preserve">Ask follow-up questions: What helped? What felt rushed? What made them feel heard or dismissed?</w:t>
+        <w:t>Ask follow-up questions: What helped? What felt rushed? What made them feel heard or dismissed?</w:t>
       </w:r>
     </w:p>
     <w:p>
@@ -484,40 +434,37 @@
         <w:pStyle w:val="BodyText"/>
       </w:pPr>
       <w:r>
-        <w:t xml:space="preserve">Click</w:t>
-      </w:r>
-      <w:r>
-        <w:t xml:space="preserve"> </w:t>
+        <w:t xml:space="preserve">Click </w:t>
       </w:r>
       <w:r>
         <w:rPr>
           <w:b/>
           <w:bCs/>
         </w:rPr>
-        <w:t xml:space="preserve">Get Assessment</w:t>
-      </w:r>
-      <w:r>
-        <w:t xml:space="preserve"> </w:t>
-      </w:r>
-      <w:r>
-        <w:t xml:space="preserve">when you are ready to see your results.</w:t>
-      </w:r>
-    </w:p>
-    <w:p>
-      <w:r>
-        <w:pict>
-          <v:rect style="width:0;height:1.5pt" o:hralign="center" o:hrstd="t" o:hr="t"/>
+        <w:t>Get Assessment</w:t>
+      </w:r>
+      <w:r>
+        <w:t xml:space="preserve"> when you are ready to see your results.</w:t>
+      </w:r>
+    </w:p>
+    <w:p>
+      <w:r>
+        <w:rPr>
+          <w:noProof/>
+        </w:rPr>
+        <w:pict w14:anchorId="386C2124">
+          <v:rect id="_x0000_i1032" alt="" style="width:468pt;height:.05pt;mso-width-percent:0;mso-height-percent:0;mso-width-percent:0;mso-height-percent:0" o:hralign="center" o:hrstd="t" o:hr="t"/>
         </w:pict>
       </w:r>
     </w:p>
-    <w:bookmarkEnd w:id="14"/>
-    <w:bookmarkStart w:id="15" w:name="step-6-view-your-assessment"/>
     <w:p>
       <w:pPr>
         <w:pStyle w:val="Heading2"/>
       </w:pPr>
-      <w:r>
-        <w:t xml:space="preserve">Step 6 — View Your Assessment</w:t>
+      <w:bookmarkStart w:id="7" w:name="step-6-view-your-assessment"/>
+      <w:bookmarkEnd w:id="6"/>
+      <w:r>
+        <w:t>Step 6 — View Your Assessment</w:t>
       </w:r>
     </w:p>
     <w:p>
@@ -525,7 +472,7 @@
         <w:pStyle w:val="FirstParagraph"/>
       </w:pPr>
       <w:r>
-        <w:t xml:space="preserve">Your performance is assessed across six criteria:</w:t>
+        <w:t>Your performance is assessed across six criteria:</w:t>
       </w:r>
     </w:p>
     <w:p>
@@ -533,11 +480,11 @@
         <w:pStyle w:val="Compact"/>
         <w:numPr>
           <w:ilvl w:val="0"/>
-          <w:numId w:val="1002"/>
+          <w:numId w:val="3"/>
         </w:numPr>
       </w:pPr>
       <w:r>
-        <w:t xml:space="preserve">Establishing Initial Rapport</w:t>
+        <w:t>Establishing Initial Rapport</w:t>
       </w:r>
     </w:p>
     <w:p>
@@ -545,11 +492,11 @@
         <w:pStyle w:val="Compact"/>
         <w:numPr>
           <w:ilvl w:val="0"/>
-          <w:numId w:val="1002"/>
+          <w:numId w:val="3"/>
         </w:numPr>
       </w:pPr>
       <w:r>
-        <w:t xml:space="preserve">Explaining Informed Consent</w:t>
+        <w:t>Explaining Informed Consent</w:t>
       </w:r>
     </w:p>
     <w:p>
@@ -557,11 +504,11 @@
         <w:pStyle w:val="Compact"/>
         <w:numPr>
           <w:ilvl w:val="0"/>
-          <w:numId w:val="1002"/>
+          <w:numId w:val="3"/>
         </w:numPr>
       </w:pPr>
       <w:r>
-        <w:t xml:space="preserve">Active Listening and Empathy</w:t>
+        <w:t>Active Listening and Empathy</w:t>
       </w:r>
     </w:p>
     <w:p>
@@ -569,11 +516,11 @@
         <w:pStyle w:val="Compact"/>
         <w:numPr>
           <w:ilvl w:val="0"/>
-          <w:numId w:val="1002"/>
+          <w:numId w:val="3"/>
         </w:numPr>
       </w:pPr>
       <w:r>
-        <w:t xml:space="preserve">Clarity and Organization</w:t>
+        <w:t>Clarity and Organization</w:t>
       </w:r>
     </w:p>
     <w:p>
@@ -581,11 +528,12 @@
         <w:pStyle w:val="Compact"/>
         <w:numPr>
           <w:ilvl w:val="0"/>
-          <w:numId w:val="1002"/>
+          <w:numId w:val="3"/>
         </w:numPr>
       </w:pPr>
       <w:r>
-        <w:t xml:space="preserve">Professionalism and Tone</w:t>
+        <w:lastRenderedPageBreak/>
+        <w:t>Professionalism and Tone</w:t>
       </w:r>
     </w:p>
     <w:p>
@@ -593,11 +541,11 @@
         <w:pStyle w:val="Compact"/>
         <w:numPr>
           <w:ilvl w:val="0"/>
-          <w:numId w:val="1002"/>
+          <w:numId w:val="3"/>
         </w:numPr>
       </w:pPr>
       <w:r>
-        <w:t xml:space="preserve">Client-Centered Approach</w:t>
+        <w:t>Client-Centered Approach</w:t>
       </w:r>
     </w:p>
     <w:p>
@@ -605,50 +553,47 @@
         <w:pStyle w:val="FirstParagraph"/>
       </w:pPr>
       <w:r>
-        <w:t xml:space="preserve">Each criterion receives a rating:</w:t>
-      </w:r>
-      <w:r>
-        <w:t xml:space="preserve"> </w:t>
+        <w:t xml:space="preserve">Each criterion receives a rating: </w:t>
       </w:r>
       <w:r>
         <w:rPr>
           <w:b/>
           <w:bCs/>
         </w:rPr>
-        <w:t xml:space="preserve">Excellent, Proficient, Developing, Not Observed</w:t>
-      </w:r>
-      <w:r>
-        <w:t xml:space="preserve">, or</w:t>
-      </w:r>
-      <w:r>
-        <w:t xml:space="preserve"> </w:t>
+        <w:t>Excellent, Proficient, Developing, Not Observed</w:t>
+      </w:r>
+      <w:r>
+        <w:t xml:space="preserve">, or </w:t>
       </w:r>
       <w:r>
         <w:rPr>
           <w:b/>
           <w:bCs/>
         </w:rPr>
-        <w:t xml:space="preserve">Insufficient</w:t>
-      </w:r>
-      <w:r>
-        <w:t xml:space="preserve">, along with specific observations from the session.</w:t>
-      </w:r>
-    </w:p>
-    <w:p>
-      <w:r>
-        <w:pict>
-          <v:rect style="width:0;height:1.5pt" o:hralign="center" o:hrstd="t" o:hr="t"/>
+        <w:t>Insufficient</w:t>
+      </w:r>
+      <w:r>
+        <w:t>, along with specific observations from the session.</w:t>
+      </w:r>
+    </w:p>
+    <w:p>
+      <w:r>
+        <w:rPr>
+          <w:noProof/>
+        </w:rPr>
+        <w:pict w14:anchorId="66A3DB27">
+          <v:rect id="_x0000_i1031" alt="" style="width:468pt;height:.05pt;mso-width-percent:0;mso-height-percent:0;mso-width-percent:0;mso-height-percent:0" o:hralign="center" o:hrstd="t" o:hr="t"/>
         </w:pict>
       </w:r>
     </w:p>
-    <w:bookmarkEnd w:id="15"/>
-    <w:bookmarkStart w:id="16" w:name="step-7-save-your-results"/>
     <w:p>
       <w:pPr>
         <w:pStyle w:val="Heading2"/>
       </w:pPr>
-      <w:r>
-        <w:t xml:space="preserve">Step 7 — Save Your Results</w:t>
+      <w:bookmarkStart w:id="8" w:name="step-7-save-your-results"/>
+      <w:bookmarkEnd w:id="7"/>
+      <w:r>
+        <w:t>Step 7 — Save Your Results</w:t>
       </w:r>
     </w:p>
     <w:p>
@@ -660,13 +605,10 @@
           <w:b/>
           <w:bCs/>
         </w:rPr>
-        <w:t xml:space="preserve">To download a PDF of your complete session</w:t>
-      </w:r>
-      <w:r>
-        <w:t xml:space="preserve"> </w:t>
-      </w:r>
-      <w:r>
-        <w:t xml:space="preserve">(assessment rubric + full transcript):</w:t>
+        <w:t>To download a PDF of your complete session</w:t>
+      </w:r>
+      <w:r>
+        <w:t xml:space="preserve"> (assessment rubric + full transcript):</w:t>
       </w:r>
     </w:p>
     <w:p>
@@ -674,23 +616,17 @@
         <w:pStyle w:val="BodyText"/>
       </w:pPr>
       <w:r>
-        <w:t xml:space="preserve">Click the</w:t>
-      </w:r>
-      <w:r>
-        <w:t xml:space="preserve"> </w:t>
+        <w:t xml:space="preserve">Click the </w:t>
       </w:r>
       <w:r>
         <w:rPr>
           <w:b/>
           <w:bCs/>
         </w:rPr>
-        <w:t xml:space="preserve">Download PDF</w:t>
-      </w:r>
-      <w:r>
-        <w:t xml:space="preserve"> </w:t>
-      </w:r>
-      <w:r>
-        <w:t xml:space="preserve">button at the bottom of the Assessment screen. The file saves automatically to your downloads folder.</w:t>
+        <w:t>Download PDF</w:t>
+      </w:r>
+      <w:r>
+        <w:t xml:space="preserve"> button at the bottom of the Assessment screen. The file saves automatically to your downloads folder.</w:t>
       </w:r>
     </w:p>
     <w:p>
@@ -698,7 +634,7 @@
         <w:pStyle w:val="BodyText"/>
       </w:pPr>
       <w:r>
-        <w:t xml:space="preserve">The PDF includes:</w:t>
+        <w:t>The PDF includes:</w:t>
       </w:r>
     </w:p>
     <w:p>
@@ -706,11 +642,11 @@
         <w:pStyle w:val="Compact"/>
         <w:numPr>
           <w:ilvl w:val="0"/>
-          <w:numId w:val="1003"/>
+          <w:numId w:val="4"/>
         </w:numPr>
       </w:pPr>
       <w:r>
-        <w:t xml:space="preserve">Your rubric scores with written observations for each criterion</w:t>
+        <w:t>Your rubric scores with written observations for each criterion</w:t>
       </w:r>
     </w:p>
     <w:p>
@@ -718,11 +654,11 @@
         <w:pStyle w:val="Compact"/>
         <w:numPr>
           <w:ilvl w:val="0"/>
-          <w:numId w:val="1003"/>
+          <w:numId w:val="4"/>
         </w:numPr>
       </w:pPr>
       <w:r>
-        <w:t xml:space="preserve">The complete interview transcript</w:t>
+        <w:t>The complete interview transcript</w:t>
       </w:r>
     </w:p>
     <w:p>
@@ -730,11 +666,11 @@
         <w:pStyle w:val="Compact"/>
         <w:numPr>
           <w:ilvl w:val="0"/>
-          <w:numId w:val="1003"/>
+          <w:numId w:val="4"/>
         </w:numPr>
       </w:pPr>
       <w:r>
-        <w:t xml:space="preserve">The client reflection transcript</w:t>
+        <w:t>The client reflection transcript</w:t>
       </w:r>
     </w:p>
     <w:p>
@@ -742,11 +678,11 @@
         <w:pStyle w:val="Compact"/>
         <w:numPr>
           <w:ilvl w:val="0"/>
-          <w:numId w:val="1003"/>
+          <w:numId w:val="4"/>
         </w:numPr>
       </w:pPr>
       <w:r>
-        <w:t xml:space="preserve">Session statistics</w:t>
+        <w:t>Session statistics</w:t>
       </w:r>
     </w:p>
     <w:p>
@@ -758,13 +694,10 @@
           <w:b/>
           <w:bCs/>
         </w:rPr>
-        <w:t xml:space="preserve">Keep this file</w:t>
-      </w:r>
-      <w:r>
-        <w:t xml:space="preserve"> </w:t>
-      </w:r>
-      <w:r>
-        <w:t xml:space="preserve">— you may be required to submit it as part of your course assignment.</w:t>
+        <w:t>Keep this file</w:t>
+      </w:r>
+      <w:r>
+        <w:t xml:space="preserve"> — you may be required to submit it as part of your course assignment.</w:t>
       </w:r>
     </w:p>
     <w:p>
@@ -772,47 +705,47 @@
         <w:pStyle w:val="BlockText"/>
       </w:pPr>
       <w:r>
-        <w:t xml:space="preserve">If you click</w:t>
-      </w:r>
-      <w:r>
-        <w:t xml:space="preserve"> </w:t>
+        <w:t xml:space="preserve">If you click </w:t>
       </w:r>
       <w:r>
         <w:rPr>
           <w:b/>
           <w:bCs/>
         </w:rPr>
-        <w:t xml:space="preserve">Try Again</w:t>
-      </w:r>
-      <w:r>
-        <w:t xml:space="preserve">, your current session will be cleared. Download your PDF first.</w:t>
-      </w:r>
-    </w:p>
-    <w:p>
-      <w:r>
-        <w:pict>
-          <v:rect style="width:0;height:1.5pt" o:hralign="center" o:hrstd="t" o:hr="t"/>
+        <w:t>Try Again</w:t>
+      </w:r>
+      <w:r>
+        <w:t>, your current session will be cleared. Download your PDF first.</w:t>
+      </w:r>
+    </w:p>
+    <w:p>
+      <w:r>
+        <w:rPr>
+          <w:noProof/>
+        </w:rPr>
+        <w:pict w14:anchorId="723A0392">
+          <v:rect id="_x0000_i1030" alt="" style="width:468pt;height:.05pt;mso-width-percent:0;mso-height-percent:0;mso-width-percent:0;mso-height-percent:0" o:hralign="center" o:hrstd="t" o:hr="t"/>
         </w:pict>
       </w:r>
     </w:p>
-    <w:bookmarkEnd w:id="16"/>
-    <w:bookmarkEnd w:id="17"/>
-    <w:bookmarkStart w:id="23" w:name="for-faculty"/>
     <w:p>
       <w:pPr>
         <w:pStyle w:val="Heading1"/>
       </w:pPr>
-      <w:r>
-        <w:t xml:space="preserve">For Faculty</w:t>
-      </w:r>
-    </w:p>
-    <w:bookmarkStart w:id="18" w:name="what-the-simulator-evaluates"/>
+      <w:bookmarkStart w:id="9" w:name="for-faculty"/>
+      <w:bookmarkEnd w:id="0"/>
+      <w:bookmarkEnd w:id="8"/>
+      <w:r>
+        <w:t>For Faculty</w:t>
+      </w:r>
+    </w:p>
     <w:p>
       <w:pPr>
         <w:pStyle w:val="Heading2"/>
       </w:pPr>
-      <w:r>
-        <w:t xml:space="preserve">What the Simulator Evaluates</w:t>
+      <w:bookmarkStart w:id="10" w:name="what-the-simulator-evaluates"/>
+      <w:r>
+        <w:t>What the Simulator Evaluates</w:t>
       </w:r>
     </w:p>
     <w:p>
@@ -820,7 +753,7 @@
         <w:pStyle w:val="FirstParagraph"/>
       </w:pPr>
       <w:r>
-        <w:t xml:space="preserve">The simulator uses a rubric aligned to the competencies in SWK3103 / SWK2113 Generalist Practice. The AI client (Claude Haiku) responds in character based on the student’s tone, phrasing, and engagement approach — not just the words they use.</w:t>
+        <w:t>The simulator uses a rubric aligned to the competencies in SWK3103 / SWK2113 Generalist Practice. The AI client (Claude Haiku) responds in character based on the student’s tone, phrasing, and engagement approach — not just the words they use.</w:t>
       </w:r>
     </w:p>
     <w:p>
@@ -828,187 +761,217 @@
         <w:pStyle w:val="BodyText"/>
       </w:pPr>
       <w:r>
-        <w:t xml:space="preserve">Each session is assessed across six criteria:</w:t>
+        <w:t>Each session is assessed across six criteria:</w:t>
       </w:r>
     </w:p>
     <w:tbl>
       <w:tblPr>
         <w:tblStyle w:val="Table"/>
-        <w:tblW w:type="pct" w:w="5000"/>
+        <w:tblW w:w="5000" w:type="pct"/>
         <w:tblLayout w:type="fixed"/>
-        <w:tblLook w:firstRow="1" w:lastRow="0" w:firstColumn="0" w:lastColumn="0" w:noHBand="0" w:noVBand="0" w:val="0020"/>
+        <w:tblLook w:val="0020" w:firstRow="1" w:lastRow="0" w:firstColumn="0" w:lastColumn="0" w:noHBand="0" w:noVBand="0"/>
       </w:tblPr>
       <w:tblGrid>
-        <w:gridCol w:w="3111"/>
-        <w:gridCol w:w="4808"/>
+        <w:gridCol w:w="3762"/>
+        <w:gridCol w:w="5814"/>
       </w:tblGrid>
       <w:tr>
         <w:trPr>
-          <w:tblHeader w:val="on"/>
+          <w:cnfStyle w:val="100000000000" w:firstRow="1" w:lastRow="0" w:firstColumn="0" w:lastColumn="0" w:oddVBand="0" w:evenVBand="0" w:oddHBand="0" w:evenHBand="0" w:firstRowFirstColumn="0" w:firstRowLastColumn="0" w:lastRowFirstColumn="0" w:lastRowLastColumn="0"/>
+          <w:tblHeader/>
         </w:trPr>
         <w:tc>
-          <w:tcPr/>
+          <w:tcPr>
+            <w:tcW w:w="3111" w:type="dxa"/>
+          </w:tcPr>
           <w:p>
             <w:pPr>
               <w:pStyle w:val="Compact"/>
             </w:pPr>
             <w:r>
-              <w:t xml:space="preserve">Criterion</w:t>
+              <w:t>Criterion</w:t>
             </w:r>
           </w:p>
         </w:tc>
         <w:tc>
-          <w:tcPr/>
+          <w:tcPr>
+            <w:tcW w:w="4808" w:type="dxa"/>
+          </w:tcPr>
           <w:p>
             <w:pPr>
               <w:pStyle w:val="Compact"/>
             </w:pPr>
             <w:r>
-              <w:t xml:space="preserve">What It Measures</w:t>
+              <w:t>What It Measures</w:t>
             </w:r>
           </w:p>
         </w:tc>
       </w:tr>
       <w:tr>
         <w:tc>
-          <w:tcPr/>
+          <w:tcPr>
+            <w:tcW w:w="3111" w:type="dxa"/>
+          </w:tcPr>
           <w:p>
             <w:pPr>
               <w:pStyle w:val="Compact"/>
             </w:pPr>
             <w:r>
-              <w:t xml:space="preserve">Establishing Initial Rapport</w:t>
+              <w:t>Establishing Initial Rapport</w:t>
             </w:r>
           </w:p>
         </w:tc>
         <w:tc>
-          <w:tcPr/>
+          <w:tcPr>
+            <w:tcW w:w="4808" w:type="dxa"/>
+          </w:tcPr>
           <w:p>
             <w:pPr>
               <w:pStyle w:val="Compact"/>
             </w:pPr>
             <w:r>
-              <w:t xml:space="preserve">Greeting, name, comfort-building in the opening moments</w:t>
+              <w:t>Greeting, name, comfort-building in the opening moments</w:t>
             </w:r>
           </w:p>
         </w:tc>
       </w:tr>
       <w:tr>
         <w:tc>
-          <w:tcPr/>
+          <w:tcPr>
+            <w:tcW w:w="3111" w:type="dxa"/>
+          </w:tcPr>
           <w:p>
             <w:pPr>
               <w:pStyle w:val="Compact"/>
             </w:pPr>
             <w:r>
-              <w:t xml:space="preserve">Explaining Informed Consent</w:t>
+              <w:t>Explaining Informed Consent</w:t>
             </w:r>
           </w:p>
         </w:tc>
         <w:tc>
-          <w:tcPr/>
+          <w:tcPr>
+            <w:tcW w:w="4808" w:type="dxa"/>
+          </w:tcPr>
           <w:p>
             <w:pPr>
               <w:pStyle w:val="Compact"/>
             </w:pPr>
             <w:r>
-              <w:t xml:space="preserve">Clarity, completeness, and client understanding of rights</w:t>
+              <w:t>Clarity, completeness, and client understanding of rights</w:t>
             </w:r>
           </w:p>
         </w:tc>
       </w:tr>
       <w:tr>
         <w:tc>
-          <w:tcPr/>
+          <w:tcPr>
+            <w:tcW w:w="3111" w:type="dxa"/>
+          </w:tcPr>
           <w:p>
             <w:pPr>
               <w:pStyle w:val="Compact"/>
             </w:pPr>
             <w:r>
-              <w:t xml:space="preserve">Active Listening and Empathy</w:t>
+              <w:t>Active Listening and Empathy</w:t>
             </w:r>
           </w:p>
         </w:tc>
         <w:tc>
-          <w:tcPr/>
+          <w:tcPr>
+            <w:tcW w:w="4808" w:type="dxa"/>
+          </w:tcPr>
           <w:p>
             <w:pPr>
               <w:pStyle w:val="Compact"/>
             </w:pPr>
             <w:r>
-              <w:t xml:space="preserve">Reflective responses, validation, absence of rushed or dismissive phrasing</w:t>
+              <w:t>Reflective responses, validation, absence of rushed or dismissive phrasing</w:t>
             </w:r>
           </w:p>
         </w:tc>
       </w:tr>
       <w:tr>
         <w:tc>
-          <w:tcPr/>
+          <w:tcPr>
+            <w:tcW w:w="3111" w:type="dxa"/>
+          </w:tcPr>
           <w:p>
             <w:pPr>
               <w:pStyle w:val="Compact"/>
             </w:pPr>
             <w:r>
-              <w:t xml:space="preserve">Clarity and Organization</w:t>
+              <w:lastRenderedPageBreak/>
+              <w:t>Clarity and Organization</w:t>
             </w:r>
           </w:p>
         </w:tc>
         <w:tc>
-          <w:tcPr/>
+          <w:tcPr>
+            <w:tcW w:w="4808" w:type="dxa"/>
+          </w:tcPr>
           <w:p>
             <w:pPr>
               <w:pStyle w:val="Compact"/>
             </w:pPr>
             <w:r>
-              <w:t xml:space="preserve">Logical flow, clear questions, avoiding jargon</w:t>
+              <w:t>Logical flow, clear questions, avoiding jargon</w:t>
             </w:r>
           </w:p>
         </w:tc>
       </w:tr>
       <w:tr>
         <w:tc>
-          <w:tcPr/>
+          <w:tcPr>
+            <w:tcW w:w="3111" w:type="dxa"/>
+          </w:tcPr>
           <w:p>
             <w:pPr>
               <w:pStyle w:val="Compact"/>
             </w:pPr>
             <w:r>
-              <w:t xml:space="preserve">Professionalism and Tone</w:t>
+              <w:t>Professionalism and Tone</w:t>
             </w:r>
           </w:p>
         </w:tc>
         <w:tc>
-          <w:tcPr/>
+          <w:tcPr>
+            <w:tcW w:w="4808" w:type="dxa"/>
+          </w:tcPr>
           <w:p>
             <w:pPr>
               <w:pStyle w:val="Compact"/>
             </w:pPr>
             <w:r>
-              <w:t xml:space="preserve">Appropriate boundaries, warmth without informality</w:t>
+              <w:t>Appropriate boundaries, warmth without informality</w:t>
             </w:r>
           </w:p>
         </w:tc>
       </w:tr>
       <w:tr>
         <w:tc>
-          <w:tcPr/>
+          <w:tcPr>
+            <w:tcW w:w="3111" w:type="dxa"/>
+          </w:tcPr>
           <w:p>
             <w:pPr>
               <w:pStyle w:val="Compact"/>
             </w:pPr>
             <w:r>
-              <w:t xml:space="preserve">Client-Centered Approach</w:t>
+              <w:t>Client-Centered Approach</w:t>
             </w:r>
           </w:p>
         </w:tc>
         <w:tc>
-          <w:tcPr/>
+          <w:tcPr>
+            <w:tcW w:w="4808" w:type="dxa"/>
+          </w:tcPr>
           <w:p>
             <w:pPr>
               <w:pStyle w:val="Compact"/>
             </w:pPr>
             <w:r>
-              <w:t xml:space="preserve">Following the client’s lead vs. pushing an agenda</w:t>
+              <w:t>Following the client’s lead vs. pushing an agenda</w:t>
             </w:r>
           </w:p>
         </w:tc>
@@ -1019,37 +982,37 @@
         <w:pStyle w:val="BodyText"/>
       </w:pPr>
       <w:r>
-        <w:t xml:space="preserve">Ratings follow a five-level scale:</w:t>
-      </w:r>
-      <w:r>
-        <w:t xml:space="preserve"> </w:t>
+        <w:t xml:space="preserve">Ratings follow a five-level scale: </w:t>
       </w:r>
       <w:r>
         <w:rPr>
           <w:b/>
           <w:bCs/>
         </w:rPr>
-        <w:t xml:space="preserve">Excellent, Proficient, Developing, Not Observed, Insufficient</w:t>
-      </w:r>
-      <w:r>
-        <w:t xml:space="preserve">.</w:t>
-      </w:r>
-    </w:p>
-    <w:p>
-      <w:r>
-        <w:pict>
-          <v:rect style="width:0;height:1.5pt" o:hralign="center" o:hrstd="t" o:hr="t"/>
+        <w:t>Excellent, Proficient, Developing, Not Observed, Insufficient</w:t>
+      </w:r>
+      <w:r>
+        <w:t>.</w:t>
+      </w:r>
+    </w:p>
+    <w:p>
+      <w:r>
+        <w:rPr>
+          <w:noProof/>
+        </w:rPr>
+        <w:pict w14:anchorId="258F587C">
+          <v:rect id="_x0000_i1029" alt="" style="width:468pt;height:.05pt;mso-width-percent:0;mso-height-percent:0;mso-width-percent:0;mso-height-percent:0" o:hralign="center" o:hrstd="t" o:hr="t"/>
         </w:pict>
       </w:r>
     </w:p>
-    <w:bookmarkEnd w:id="18"/>
-    <w:bookmarkStart w:id="19" w:name="what-is-in-the-student-pdf"/>
     <w:p>
       <w:pPr>
         <w:pStyle w:val="Heading2"/>
       </w:pPr>
-      <w:r>
-        <w:t xml:space="preserve">What Is in the Student PDF</w:t>
+      <w:bookmarkStart w:id="11" w:name="what-is-in-the-student-pdf"/>
+      <w:bookmarkEnd w:id="10"/>
+      <w:r>
+        <w:t>What Is in the Student PDF</w:t>
       </w:r>
     </w:p>
     <w:p>
@@ -1057,7 +1020,7 @@
         <w:pStyle w:val="FirstParagraph"/>
       </w:pPr>
       <w:r>
-        <w:t xml:space="preserve">When a student downloads their PDF, it includes:</w:t>
+        <w:t>When a student downloads their PDF, it includes:</w:t>
       </w:r>
     </w:p>
     <w:p>
@@ -1065,7 +1028,7 @@
         <w:pStyle w:val="Compact"/>
         <w:numPr>
           <w:ilvl w:val="0"/>
-          <w:numId w:val="1004"/>
+          <w:numId w:val="5"/>
         </w:numPr>
       </w:pPr>
       <w:r>
@@ -1073,13 +1036,10 @@
           <w:b/>
           <w:bCs/>
         </w:rPr>
-        <w:t xml:space="preserve">Session header</w:t>
-      </w:r>
-      <w:r>
-        <w:t xml:space="preserve"> </w:t>
-      </w:r>
-      <w:r>
-        <w:t xml:space="preserve">— client name, date printed</w:t>
+        <w:t>Session header</w:t>
+      </w:r>
+      <w:r>
+        <w:t xml:space="preserve"> — client name, date printed</w:t>
       </w:r>
     </w:p>
     <w:p>
@@ -1087,7 +1047,7 @@
         <w:pStyle w:val="Compact"/>
         <w:numPr>
           <w:ilvl w:val="0"/>
-          <w:numId w:val="1004"/>
+          <w:numId w:val="5"/>
         </w:numPr>
       </w:pPr>
       <w:r>
@@ -1095,13 +1055,10 @@
           <w:b/>
           <w:bCs/>
         </w:rPr>
-        <w:t xml:space="preserve">Session statistics</w:t>
-      </w:r>
-      <w:r>
-        <w:t xml:space="preserve"> </w:t>
-      </w:r>
-      <w:r>
-        <w:t xml:space="preserve">— number of student and client exchanges</w:t>
+        <w:t>Session statistics</w:t>
+      </w:r>
+      <w:r>
+        <w:t xml:space="preserve"> — number of student and client exchanges</w:t>
       </w:r>
     </w:p>
     <w:p>
@@ -1109,7 +1066,7 @@
         <w:pStyle w:val="Compact"/>
         <w:numPr>
           <w:ilvl w:val="0"/>
-          <w:numId w:val="1004"/>
+          <w:numId w:val="5"/>
         </w:numPr>
       </w:pPr>
       <w:r>
@@ -1117,13 +1074,10 @@
           <w:b/>
           <w:bCs/>
         </w:rPr>
-        <w:t xml:space="preserve">Rubric assessment</w:t>
-      </w:r>
-      <w:r>
-        <w:t xml:space="preserve"> </w:t>
-      </w:r>
-      <w:r>
-        <w:t xml:space="preserve">— AI-generated performance analysis with specific quotes and observations for each criterion</w:t>
+        <w:t>Rubric assessment</w:t>
+      </w:r>
+      <w:r>
+        <w:t xml:space="preserve"> — AI-generated performance analysis with specific quotes and observations for each criterion</w:t>
       </w:r>
     </w:p>
     <w:p>
@@ -1131,7 +1085,7 @@
         <w:pStyle w:val="Compact"/>
         <w:numPr>
           <w:ilvl w:val="0"/>
-          <w:numId w:val="1004"/>
+          <w:numId w:val="5"/>
         </w:numPr>
       </w:pPr>
       <w:r>
@@ -1139,13 +1093,10 @@
           <w:b/>
           <w:bCs/>
         </w:rPr>
-        <w:t xml:space="preserve">Full interview transcript</w:t>
-      </w:r>
-      <w:r>
-        <w:t xml:space="preserve"> </w:t>
-      </w:r>
-      <w:r>
-        <w:t xml:space="preserve">— every exchange between student and client, labeled</w:t>
+        <w:t>Full interview transcript</w:t>
+      </w:r>
+      <w:r>
+        <w:t xml:space="preserve"> — every exchange between student and client, labeled</w:t>
       </w:r>
     </w:p>
     <w:p>
@@ -1153,7 +1104,7 @@
         <w:pStyle w:val="Compact"/>
         <w:numPr>
           <w:ilvl w:val="0"/>
-          <w:numId w:val="1004"/>
+          <w:numId w:val="5"/>
         </w:numPr>
       </w:pPr>
       <w:r>
@@ -1161,13 +1112,10 @@
           <w:b/>
           <w:bCs/>
         </w:rPr>
-        <w:t xml:space="preserve">Client reflection transcript</w:t>
-      </w:r>
-      <w:r>
-        <w:t xml:space="preserve"> </w:t>
-      </w:r>
-      <w:r>
-        <w:t xml:space="preserve">— the post-interview feedback conversation</w:t>
+        <w:t>Client reflection transcript</w:t>
+      </w:r>
+      <w:r>
+        <w:t xml:space="preserve"> — the post-interview feedback conversation</w:t>
       </w:r>
     </w:p>
     <w:p>
@@ -1175,24 +1123,27 @@
         <w:pStyle w:val="FirstParagraph"/>
       </w:pPr>
       <w:r>
-        <w:t xml:space="preserve">This gives you everything needed to grade the session without the student needing to be present.</w:t>
-      </w:r>
-    </w:p>
-    <w:p>
-      <w:r>
-        <w:pict>
-          <v:rect style="width:0;height:1.5pt" o:hralign="center" o:hrstd="t" o:hr="t"/>
+        <w:t>This gives you everything needed to grade the session without the student needing to be present.</w:t>
+      </w:r>
+    </w:p>
+    <w:p>
+      <w:r>
+        <w:rPr>
+          <w:noProof/>
+        </w:rPr>
+        <w:pict w14:anchorId="4D052235">
+          <v:rect id="_x0000_i1028" alt="" style="width:468pt;height:.05pt;mso-width-percent:0;mso-height-percent:0;mso-width-percent:0;mso-height-percent:0" o:hralign="center" o:hrstd="t" o:hr="t"/>
         </w:pict>
       </w:r>
     </w:p>
-    <w:bookmarkEnd w:id="19"/>
-    <w:bookmarkStart w:id="20" w:name="how-to-assign-it"/>
     <w:p>
       <w:pPr>
         <w:pStyle w:val="Heading2"/>
       </w:pPr>
-      <w:r>
-        <w:t xml:space="preserve">How to Assign It</w:t>
+      <w:bookmarkStart w:id="12" w:name="how-to-assign-it"/>
+      <w:bookmarkEnd w:id="11"/>
+      <w:r>
+        <w:t>How to Assign It</w:t>
       </w:r>
     </w:p>
     <w:p>
@@ -1200,11 +1151,11 @@
         <w:pStyle w:val="Compact"/>
         <w:numPr>
           <w:ilvl w:val="0"/>
-          <w:numId w:val="1005"/>
+          <w:numId w:val="6"/>
         </w:numPr>
       </w:pPr>
       <w:r>
-        <w:t xml:space="preserve">Direct students to the app URL (provided separately).</w:t>
+        <w:t>Direct students to the app URL (provided separately).</w:t>
       </w:r>
     </w:p>
     <w:p>
@@ -1212,11 +1163,11 @@
         <w:pStyle w:val="Compact"/>
         <w:numPr>
           <w:ilvl w:val="0"/>
-          <w:numId w:val="1005"/>
+          <w:numId w:val="6"/>
         </w:numPr>
       </w:pPr>
       <w:r>
-        <w:t xml:space="preserve">Students complete the simulation, download their PDF, and submit it through your normal assignment workflow.</w:t>
+        <w:t>Students complete the simulation, download their PDF, and submit it through your normal assignment workflow.</w:t>
       </w:r>
     </w:p>
     <w:p>
@@ -1224,11 +1175,11 @@
         <w:pStyle w:val="Compact"/>
         <w:numPr>
           <w:ilvl w:val="0"/>
-          <w:numId w:val="1005"/>
+          <w:numId w:val="6"/>
         </w:numPr>
       </w:pPr>
       <w:r>
-        <w:t xml:space="preserve">No student login or account is required.</w:t>
+        <w:t>No student login or account is required.</w:t>
       </w:r>
     </w:p>
     <w:p>
@@ -1236,184 +1187,213 @@
         <w:pStyle w:val="Compact"/>
         <w:numPr>
           <w:ilvl w:val="0"/>
-          <w:numId w:val="1005"/>
+          <w:numId w:val="6"/>
         </w:numPr>
       </w:pPr>
       <w:r>
-        <w:t xml:space="preserve">Sessions are not stored on the server — each session exists only in the student’s browser until they download the PDF or close the tab.</w:t>
-      </w:r>
-    </w:p>
-    <w:p>
-      <w:r>
-        <w:pict>
-          <v:rect style="width:0;height:1.5pt" o:hralign="center" o:hrstd="t" o:hr="t"/>
+        <w:t>Sessions are not stored on the server — each session exists only in the student’s browser until they download the PDF or close the tab.</w:t>
+      </w:r>
+    </w:p>
+    <w:p>
+      <w:r>
+        <w:rPr>
+          <w:noProof/>
+        </w:rPr>
+        <w:pict w14:anchorId="17EB5999">
+          <v:rect id="_x0000_i1027" alt="" style="width:468pt;height:.05pt;mso-width-percent:0;mso-height-percent:0;mso-width-percent:0;mso-height-percent:0" o:hralign="center" o:hrstd="t" o:hr="t"/>
         </w:pict>
       </w:r>
     </w:p>
-    <w:bookmarkEnd w:id="20"/>
-    <w:bookmarkStart w:id="21" w:name="technical-requirements"/>
     <w:p>
       <w:pPr>
         <w:pStyle w:val="Heading2"/>
       </w:pPr>
-      <w:r>
-        <w:t xml:space="preserve">Technical Requirements</w:t>
+      <w:bookmarkStart w:id="13" w:name="technical-requirements"/>
+      <w:bookmarkEnd w:id="12"/>
+      <w:r>
+        <w:t>Technical Requirements</w:t>
       </w:r>
     </w:p>
     <w:tbl>
       <w:tblPr>
         <w:tblStyle w:val="Table"/>
-        <w:tblW w:type="pct" w:w="5000"/>
+        <w:tblW w:w="5000" w:type="pct"/>
         <w:tblLayout w:type="fixed"/>
-        <w:tblLook w:firstRow="1" w:lastRow="0" w:firstColumn="0" w:lastColumn="0" w:noHBand="0" w:noVBand="0" w:val="0020"/>
+        <w:tblLook w:val="0020" w:firstRow="1" w:lastRow="0" w:firstColumn="0" w:lastColumn="0" w:noHBand="0" w:noVBand="0"/>
       </w:tblPr>
       <w:tblGrid>
-        <w:gridCol w:w="4680"/>
-        <w:gridCol w:w="3240"/>
+        <w:gridCol w:w="5659"/>
+        <w:gridCol w:w="3917"/>
       </w:tblGrid>
       <w:tr>
         <w:trPr>
-          <w:tblHeader w:val="on"/>
+          <w:cnfStyle w:val="100000000000" w:firstRow="1" w:lastRow="0" w:firstColumn="0" w:lastColumn="0" w:oddVBand="0" w:evenVBand="0" w:oddHBand="0" w:evenHBand="0" w:firstRowFirstColumn="0" w:firstRowLastColumn="0" w:lastRowFirstColumn="0" w:lastRowLastColumn="0"/>
+          <w:tblHeader/>
         </w:trPr>
         <w:tc>
-          <w:tcPr/>
+          <w:tcPr>
+            <w:tcW w:w="4680" w:type="dxa"/>
+          </w:tcPr>
           <w:p>
             <w:pPr>
               <w:pStyle w:val="Compact"/>
             </w:pPr>
             <w:r>
-              <w:t xml:space="preserve">Requirement</w:t>
+              <w:t>Requirement</w:t>
             </w:r>
           </w:p>
         </w:tc>
         <w:tc>
-          <w:tcPr/>
+          <w:tcPr>
+            <w:tcW w:w="3240" w:type="dxa"/>
+          </w:tcPr>
           <w:p>
             <w:pPr>
               <w:pStyle w:val="Compact"/>
             </w:pPr>
             <w:r>
-              <w:t xml:space="preserve">Details</w:t>
+              <w:t>Details</w:t>
             </w:r>
           </w:p>
         </w:tc>
       </w:tr>
       <w:tr>
         <w:tc>
-          <w:tcPr/>
+          <w:tcPr>
+            <w:tcW w:w="4680" w:type="dxa"/>
+          </w:tcPr>
           <w:p>
             <w:pPr>
               <w:pStyle w:val="Compact"/>
             </w:pPr>
             <w:r>
-              <w:t xml:space="preserve">Browser</w:t>
+              <w:t>Browser</w:t>
             </w:r>
           </w:p>
         </w:tc>
         <w:tc>
-          <w:tcPr/>
+          <w:tcPr>
+            <w:tcW w:w="3240" w:type="dxa"/>
+          </w:tcPr>
           <w:p>
             <w:pPr>
               <w:pStyle w:val="Compact"/>
             </w:pPr>
             <w:r>
-              <w:t xml:space="preserve">Chrome or Edge recommended; Safari and Firefox supported</w:t>
+              <w:t>Chrome or Edge recommended; Safari and Firefox supported</w:t>
             </w:r>
           </w:p>
         </w:tc>
       </w:tr>
       <w:tr>
         <w:tc>
-          <w:tcPr/>
+          <w:tcPr>
+            <w:tcW w:w="4680" w:type="dxa"/>
+          </w:tcPr>
           <w:p>
             <w:pPr>
               <w:pStyle w:val="Compact"/>
             </w:pPr>
             <w:r>
-              <w:t xml:space="preserve">Internet connection</w:t>
+              <w:t>Internet connection</w:t>
             </w:r>
           </w:p>
         </w:tc>
         <w:tc>
-          <w:tcPr/>
+          <w:tcPr>
+            <w:tcW w:w="3240" w:type="dxa"/>
+          </w:tcPr>
           <w:p>
             <w:pPr>
               <w:pStyle w:val="Compact"/>
             </w:pPr>
             <w:r>
-              <w:t xml:space="preserve">Required (the app uses live AI during the session)</w:t>
+              <w:t>Required (the app uses live AI during the session)</w:t>
             </w:r>
           </w:p>
         </w:tc>
       </w:tr>
       <w:tr>
         <w:tc>
-          <w:tcPr/>
+          <w:tcPr>
+            <w:tcW w:w="4680" w:type="dxa"/>
+          </w:tcPr>
           <w:p>
             <w:pPr>
               <w:pStyle w:val="Compact"/>
             </w:pPr>
             <w:r>
-              <w:t xml:space="preserve">Microphone</w:t>
+              <w:t>Microphone</w:t>
             </w:r>
           </w:p>
         </w:tc>
         <w:tc>
-          <w:tcPr/>
+          <w:tcPr>
+            <w:tcW w:w="3240" w:type="dxa"/>
+          </w:tcPr>
           <w:p>
             <w:pPr>
               <w:pStyle w:val="Compact"/>
             </w:pPr>
             <w:r>
-              <w:t xml:space="preserve">Optional — students can use text input instead</w:t>
+              <w:t>Optional — students can use text input instead</w:t>
             </w:r>
           </w:p>
         </w:tc>
       </w:tr>
       <w:tr>
         <w:tc>
-          <w:tcPr/>
+          <w:tcPr>
+            <w:tcW w:w="4680" w:type="dxa"/>
+          </w:tcPr>
           <w:p>
             <w:pPr>
               <w:pStyle w:val="Compact"/>
             </w:pPr>
             <w:r>
-              <w:t xml:space="preserve">Login / account</w:t>
+              <w:lastRenderedPageBreak/>
+              <w:t>Login / account</w:t>
             </w:r>
           </w:p>
         </w:tc>
         <w:tc>
-          <w:tcPr/>
+          <w:tcPr>
+            <w:tcW w:w="3240" w:type="dxa"/>
+          </w:tcPr>
           <w:p>
             <w:pPr>
               <w:pStyle w:val="Compact"/>
             </w:pPr>
             <w:r>
-              <w:t xml:space="preserve">Not required</w:t>
+              <w:t>Not required</w:t>
             </w:r>
           </w:p>
         </w:tc>
       </w:tr>
       <w:tr>
         <w:tc>
-          <w:tcPr/>
+          <w:tcPr>
+            <w:tcW w:w="4680" w:type="dxa"/>
+          </w:tcPr>
           <w:p>
             <w:pPr>
               <w:pStyle w:val="Compact"/>
             </w:pPr>
             <w:r>
-              <w:t xml:space="preserve">Mobile</w:t>
+              <w:t>Mobile</w:t>
             </w:r>
           </w:p>
         </w:tc>
         <w:tc>
-          <w:tcPr/>
+          <w:tcPr>
+            <w:tcW w:w="3240" w:type="dxa"/>
+          </w:tcPr>
           <w:p>
             <w:pPr>
               <w:pStyle w:val="Compact"/>
             </w:pPr>
             <w:r>
-              <w:t xml:space="preserve">Functional, but desktop recommended for the reference panel</w:t>
+              <w:t>Functional, but desktop recommended for the reference panel</w:t>
             </w:r>
           </w:p>
         </w:tc>
@@ -1421,19 +1401,22 @@
     </w:tbl>
     <w:p>
       <w:r>
-        <w:pict>
-          <v:rect style="width:0;height:1.5pt" o:hralign="center" o:hrstd="t" o:hr="t"/>
+        <w:rPr>
+          <w:noProof/>
+        </w:rPr>
+        <w:pict w14:anchorId="331B20E5">
+          <v:rect id="_x0000_i1026" alt="" style="width:468pt;height:.05pt;mso-width-percent:0;mso-height-percent:0;mso-width-percent:0;mso-height-percent:0" o:hralign="center" o:hrstd="t" o:hr="t"/>
         </w:pict>
       </w:r>
     </w:p>
-    <w:bookmarkEnd w:id="21"/>
-    <w:bookmarkStart w:id="22" w:name="notes-for-instructors"/>
     <w:p>
       <w:pPr>
         <w:pStyle w:val="Heading2"/>
       </w:pPr>
-      <w:r>
-        <w:t xml:space="preserve">Notes for Instructors</w:t>
+      <w:bookmarkStart w:id="14" w:name="notes-for-instructors"/>
+      <w:bookmarkEnd w:id="13"/>
+      <w:r>
+        <w:t>Notes for Instructors</w:t>
       </w:r>
     </w:p>
     <w:p>
@@ -1445,13 +1428,10 @@
           <w:b/>
           <w:bCs/>
         </w:rPr>
-        <w:t xml:space="preserve">AI variability:</w:t>
-      </w:r>
-      <w:r>
-        <w:t xml:space="preserve"> </w:t>
-      </w:r>
-      <w:r>
-        <w:t xml:space="preserve">The client’s responses are generated by AI and will vary between sessions. Two students interviewing the same client will have different conversations. This is intentional — it reflects real client variability.</w:t>
+        <w:t>AI variability:</w:t>
+      </w:r>
+      <w:r>
+        <w:t xml:space="preserve"> The client’s responses are generated by AI and will vary between sessions. Two students interviewing the same client will have different conversations. This is intentional — it reflects real client variability.</w:t>
       </w:r>
     </w:p>
     <w:p>
@@ -1463,13 +1443,10 @@
           <w:b/>
           <w:bCs/>
         </w:rPr>
-        <w:t xml:space="preserve">Assessment quality:</w:t>
-      </w:r>
-      <w:r>
-        <w:t xml:space="preserve"> </w:t>
-      </w:r>
-      <w:r>
-        <w:t xml:space="preserve">The rubric assessment is AI-generated based on the full transcript. It provides specific, evidence-based observations for each criterion. Review the transcript alongside the rubric when grading.</w:t>
+        <w:t>Assessment quality:</w:t>
+      </w:r>
+      <w:r>
+        <w:t xml:space="preserve"> The rubric assessment is AI-generated based on the full transcript. It provides specific, evidence-based observations for each criterion. Review the transcript alongside the rubric when grading.</w:t>
       </w:r>
     </w:p>
     <w:p>
@@ -1481,13 +1458,10 @@
           <w:b/>
           <w:bCs/>
         </w:rPr>
-        <w:t xml:space="preserve">Reuse:</w:t>
-      </w:r>
-      <w:r>
-        <w:t xml:space="preserve"> </w:t>
-      </w:r>
-      <w:r>
-        <w:t xml:space="preserve">Students can run as many sessions as they want. Encourage them to attempt the scenario multiple times and compare their PDFs to track growth.</w:t>
+        <w:t>Reuse:</w:t>
+      </w:r>
+      <w:r>
+        <w:t xml:space="preserve"> Students can run as many sessions as they want. Encourage them to attempt the scenario multiple times and compare their PDFs to track growth.</w:t>
       </w:r>
     </w:p>
     <w:p>
@@ -1499,19 +1473,19 @@
           <w:b/>
           <w:bCs/>
         </w:rPr>
-        <w:t xml:space="preserve">Advanced scenarios:</w:t>
-      </w:r>
-      <w:r>
-        <w:t xml:space="preserve"> </w:t>
-      </w:r>
-      <w:r>
-        <w:t xml:space="preserve">Carlos and Aisha involve sensitive presenting contexts (reentry/parole and domestic violence, respectively). Assign these intentionally and consider pairing with in-class debrief.</w:t>
-      </w:r>
-    </w:p>
-    <w:p>
-      <w:r>
-        <w:pict>
-          <v:rect style="width:0;height:1.5pt" o:hralign="center" o:hrstd="t" o:hr="t"/>
+        <w:t>Advanced scenarios:</w:t>
+      </w:r>
+      <w:r>
+        <w:t xml:space="preserve"> Carlos and Aisha involve sensitive presenting contexts (reentry/parole and domestic violence, respectively). Assign these intentionally and consider pairing with in-class debrief.</w:t>
+      </w:r>
+    </w:p>
+    <w:p>
+      <w:r>
+        <w:rPr>
+          <w:noProof/>
+        </w:rPr>
+        <w:pict w14:anchorId="26D68263">
+          <v:rect id="_x0000_i1025" alt="" style="width:468pt;height:.05pt;mso-width-percent:0;mso-height-percent:0;mso-width-percent:0;mso-height-percent:0" o:hralign="center" o:hrstd="t" o:hr="t"/>
         </w:pict>
       </w:r>
     </w:p>
@@ -1524,48 +1498,29 @@
           <w:i/>
           <w:iCs/>
         </w:rPr>
-        <w:t xml:space="preserve">Questions about the simulator? Contact your course instructor.</w:t>
-      </w:r>
-    </w:p>
-    <w:bookmarkEnd w:id="22"/>
-    <w:bookmarkEnd w:id="23"/>
+        <w:t>Questions about the simulator? Contact your course instructor.</w:t>
+      </w:r>
+      <w:bookmarkEnd w:id="9"/>
+      <w:bookmarkEnd w:id="14"/>
+    </w:p>
     <w:sectPr>
       <w:footnotePr>
         <w:numRestart w:val="eachSect"/>
       </w:footnotePr>
+      <w:pgSz w:w="12240" w:h="15840"/>
+      <w:pgMar w:top="1440" w:right="1440" w:bottom="1440" w:left="1440" w:header="720" w:footer="720" w:gutter="0"/>
+      <w:cols w:space="720"/>
     </w:sectPr>
   </w:body>
 </w:document>
 </file>
 
-<file path=word/comments.xml><?xml version="1.0" encoding="utf-8"?>
-<w:comments xmlns:w="http://schemas.openxmlformats.org/wordprocessingml/2006/main" xmlns:m="http://schemas.openxmlformats.org/officeDocument/2006/math" xmlns:r="http://schemas.openxmlformats.org/officeDocument/2006/relationships" xmlns:o="urn:schemas-microsoft-com:office:office" xmlns:v="urn:schemas-microsoft-com:vml" xmlns:w10="urn:schemas-microsoft-com:office:word" xmlns:a="http://schemas.openxmlformats.org/drawingml/2006/main" xmlns:pic="http://schemas.openxmlformats.org/drawingml/2006/picture" xmlns:wp="http://schemas.openxmlformats.org/drawingml/2006/wordprocessingDrawing"/>
-</file>
-
-<file path=word/footnotes.xml><?xml version="1.0" encoding="utf-8"?>
-<w:footnotes xmlns:w="http://schemas.openxmlformats.org/wordprocessingml/2006/main" xmlns:m="http://schemas.openxmlformats.org/officeDocument/2006/math" xmlns:r="http://schemas.openxmlformats.org/officeDocument/2006/relationships" xmlns:o="urn:schemas-microsoft-com:office:office" xmlns:v="urn:schemas-microsoft-com:vml" xmlns:w10="urn:schemas-microsoft-com:office:word" xmlns:a="http://schemas.openxmlformats.org/drawingml/2006/main" xmlns:pic="http://schemas.openxmlformats.org/drawingml/2006/picture" xmlns:wp="http://schemas.openxmlformats.org/drawingml/2006/wordprocessingDrawing">
-  <w:footnote w:type="continuationSeparator" w:id="0">
-    <w:p>
-      <w:r>
-        <w:continuationSeparator/>
-      </w:r>
-    </w:p>
-  </w:footnote>
-  <w:footnote w:type="separator" w:id="-1">
-    <w:p>
-      <w:r>
-        <w:separator/>
-      </w:r>
-    </w:p>
-  </w:footnote>
-</w:footnotes>
-</file>
-
 <file path=word/numbering.xml><?xml version="1.0" encoding="utf-8"?>
-<w:numbering xmlns:w="http://schemas.openxmlformats.org/wordprocessingml/2006/main">
-  <w:abstractNum w:abstractNumId="990">
+<w:numbering xmlns:wpc="http://schemas.microsoft.com/office/word/2010/wordprocessingCanvas" xmlns:cx="http://schemas.microsoft.com/office/drawing/2014/chartex" xmlns:cx1="http://schemas.microsoft.com/office/drawing/2015/9/8/chartex" xmlns:cx2="http://schemas.microsoft.com/office/drawing/2015/10/21/chartex" xmlns:cx3="http://schemas.microsoft.com/office/drawing/2016/5/9/chartex" xmlns:cx4="http://schemas.microsoft.com/office/drawing/2016/5/10/chartex" xmlns:cx5="http://schemas.microsoft.com/office/drawing/2016/5/11/chartex" xmlns:cx6="http://schemas.microsoft.com/office/drawing/2016/5/12/chartex" xmlns:cx7="http://schemas.microsoft.com/office/drawing/2016/5/13/chartex" xmlns:cx8="http://schemas.microsoft.com/office/drawing/2016/5/14/chartex" xmlns:mc="http://schemas.openxmlformats.org/markup-compatibility/2006" xmlns:aink="http://schemas.microsoft.com/office/drawing/2016/ink" xmlns:am3d="http://schemas.microsoft.com/office/drawing/2017/model3d" xmlns:o="urn:schemas-microsoft-com:office:office" xmlns:oel="http://schemas.microsoft.com/office/2019/extlst" xmlns:r="http://schemas.openxmlformats.org/officeDocument/2006/relationships" xmlns:m="http://schemas.openxmlformats.org/officeDocument/2006/math" xmlns:v="urn:schemas-microsoft-com:vml" xmlns:wp14="http://schemas.microsoft.com/office/word/2010/wordprocessingDrawing" xmlns:wp="http://schemas.openxmlformats.org/drawingml/2006/wordprocessingDrawing" xmlns:w10="urn:schemas-microsoft-com:office:word" xmlns:w="http://schemas.openxmlformats.org/wordprocessingml/2006/main" xmlns:w14="http://schemas.microsoft.com/office/word/2010/wordml" xmlns:w15="http://schemas.microsoft.com/office/word/2012/wordml" xmlns:w16cex="http://schemas.microsoft.com/office/word/2018/wordml/cex" xmlns:w16cid="http://schemas.microsoft.com/office/word/2016/wordml/cid" xmlns:w16="http://schemas.microsoft.com/office/word/2018/wordml" xmlns:w16du="http://schemas.microsoft.com/office/word/2023/wordml/word16du" xmlns:w16sdtdh="http://schemas.microsoft.com/office/word/2020/wordml/sdtdatahash" xmlns:w16sdtfl="http://schemas.microsoft.com/office/word/2024/wordml/sdtformatlock" xmlns:w16se="http://schemas.microsoft.com/office/word/2015/wordml/symex" xmlns:wpg="http://schemas.microsoft.com/office/word/2010/wordprocessingGroup" xmlns:wpi="http://schemas.microsoft.com/office/word/2010/wordprocessingInk" xmlns:wne="http://schemas.microsoft.com/office/word/2006/wordml" xmlns:wps="http://schemas.microsoft.com/office/word/2010/wordprocessingShape" mc:Ignorable="w14 w15 w16se w16cid w16 w16cex w16sdtdh w16sdtfl w16du wp14">
+  <w:abstractNum w:abstractNumId="0" w15:restartNumberingAfterBreak="0">
     <w:nsid w:val="0000A990"/>
     <w:multiLevelType w:val="multilevel"/>
+    <w:tmpl w:val="0E88EA14"/>
     <w:lvl w:ilvl="0">
       <w:numFmt w:val="bullet"/>
       <w:lvlText w:val=" "/>
@@ -1639,9 +1594,10 @@
       </w:pPr>
     </w:lvl>
   </w:abstractNum>
-  <w:abstractNum w:abstractNumId="991">
+  <w:abstractNum w:abstractNumId="1" w15:restartNumberingAfterBreak="0">
     <w:nsid w:val="0000A991"/>
     <w:multiLevelType w:val="multilevel"/>
+    <w:tmpl w:val="122A4042"/>
     <w:lvl w:ilvl="0">
       <w:numFmt w:val="bullet"/>
       <w:lvlText w:val=""/>
@@ -1742,9 +1698,10 @@
       </w:rPr>
     </w:lvl>
   </w:abstractNum>
-  <w:abstractNum w:abstractNumId="99411">
+  <w:abstractNum w:abstractNumId="2" w15:restartNumberingAfterBreak="0">
     <w:nsid w:val="00A99411"/>
     <w:multiLevelType w:val="multilevel"/>
+    <w:tmpl w:val="A030ECD0"/>
     <w:lvl w:ilvl="0">
       <w:start w:val="1"/>
       <w:numFmt w:val="decimal"/>
@@ -1827,14 +1784,14 @@
       </w:pPr>
     </w:lvl>
   </w:abstractNum>
-  <w:num w:numId="1000">
-    <w:abstractNumId w:val="990"/>
+  <w:num w:numId="1" w16cid:durableId="1540050989">
+    <w:abstractNumId w:val="0"/>
   </w:num>
-  <w:num w:numId="1001">
-    <w:abstractNumId w:val="991"/>
+  <w:num w:numId="2" w16cid:durableId="720328711">
+    <w:abstractNumId w:val="1"/>
   </w:num>
-  <w:num w:numId="1002">
-    <w:abstractNumId w:val="99411"/>
+  <w:num w:numId="3" w16cid:durableId="519779415">
+    <w:abstractNumId w:val="2"/>
     <w:lvlOverride w:ilvl="0">
       <w:startOverride w:val="1"/>
     </w:lvlOverride>
@@ -1863,11 +1820,11 @@
       <w:startOverride w:val="1"/>
     </w:lvlOverride>
   </w:num>
-  <w:num w:numId="1003">
-    <w:abstractNumId w:val="991"/>
+  <w:num w:numId="4" w16cid:durableId="417020667">
+    <w:abstractNumId w:val="1"/>
   </w:num>
-  <w:num w:numId="1004">
-    <w:abstractNumId w:val="99411"/>
+  <w:num w:numId="5" w16cid:durableId="1238202765">
+    <w:abstractNumId w:val="2"/>
     <w:lvlOverride w:ilvl="0">
       <w:startOverride w:val="1"/>
     </w:lvlOverride>
@@ -1896,8 +1853,8 @@
       <w:startOverride w:val="1"/>
     </w:lvlOverride>
   </w:num>
-  <w:num w:numId="1005">
-    <w:abstractNumId w:val="99411"/>
+  <w:num w:numId="6" w16cid:durableId="40908073">
+    <w:abstractNumId w:val="2"/>
     <w:lvlOverride w:ilvl="0">
       <w:startOverride w:val="1"/>
     </w:lvlOverride>
@@ -1930,14 +1887,14 @@
 </file>
 
 <file path=word/styles.xml><?xml version="1.0" encoding="utf-8"?>
-<w:styles xmlns:r="http://schemas.openxmlformats.org/officeDocument/2006/relationships" xmlns:w="http://schemas.openxmlformats.org/wordprocessingml/2006/main">
+<w:styles xmlns:mc="http://schemas.openxmlformats.org/markup-compatibility/2006" xmlns:r="http://schemas.openxmlformats.org/officeDocument/2006/relationships" xmlns:w="http://schemas.openxmlformats.org/wordprocessingml/2006/main" xmlns:w14="http://schemas.microsoft.com/office/word/2010/wordml" xmlns:w15="http://schemas.microsoft.com/office/word/2012/wordml" xmlns:w16cex="http://schemas.microsoft.com/office/word/2018/wordml/cex" xmlns:w16cid="http://schemas.microsoft.com/office/word/2016/wordml/cid" xmlns:w16="http://schemas.microsoft.com/office/word/2018/wordml" xmlns:w16du="http://schemas.microsoft.com/office/word/2023/wordml/word16du" xmlns:w16sdtdh="http://schemas.microsoft.com/office/word/2020/wordml/sdtdatahash" xmlns:w16sdtfl="http://schemas.microsoft.com/office/word/2024/wordml/sdtformatlock" xmlns:w16se="http://schemas.microsoft.com/office/word/2015/wordml/symex" mc:Ignorable="w14 w15 w16se w16cid w16 w16cex w16sdtdh w16sdtfl w16du">
   <w:docDefaults>
     <w:rPrDefault>
       <w:rPr>
-        <w:rFonts w:asciiTheme="minorHAnsi" w:cstheme="minorBidi" w:eastAsiaTheme="minorEastAsia" w:hAnsiTheme="minorHAnsi"/>
+        <w:rFonts w:asciiTheme="minorHAnsi" w:eastAsiaTheme="minorEastAsia" w:hAnsiTheme="minorHAnsi" w:cstheme="minorBidi"/>
         <w:sz w:val="24"/>
         <w:szCs w:val="24"/>
-        <w:lang w:bidi="ar-SA" w:eastAsia="zh-CN" w:val="en-US"/>
+        <w:lang w:val="en-US" w:eastAsia="zh-CN" w:bidi="ar-SA"/>
       </w:rPr>
     </w:rPrDefault>
     <w:pPrDefault>
@@ -1946,168 +1903,255 @@
       </w:pPr>
     </w:pPrDefault>
   </w:docDefaults>
-  <w:latentStyles w:count="276" w:defLockedState="0" w:defQFormat="0" w:defSemiHidden="0" w:defUIPriority="0" w:defUnhideWhenUsed="0"/>
-  <w:style w:default="1" w:styleId="Normal" w:type="paragraph">
+  <w:latentStyles w:defLockedState="0" w:defUIPriority="0" w:defSemiHidden="0" w:defUnhideWhenUsed="0" w:defQFormat="0" w:count="376">
+    <w:lsdException w:name="Normal Table" w:semiHidden="1" w:unhideWhenUsed="1"/>
+    <w:lsdException w:name="Table Simple 1" w:semiHidden="1" w:unhideWhenUsed="1"/>
+    <w:lsdException w:name="Table Simple 2" w:semiHidden="1" w:unhideWhenUsed="1"/>
+    <w:lsdException w:name="Table Simple 3" w:semiHidden="1" w:unhideWhenUsed="1"/>
+    <w:lsdException w:name="Table Classic 1" w:semiHidden="1" w:unhideWhenUsed="1"/>
+    <w:lsdException w:name="Table Classic 2" w:semiHidden="1" w:unhideWhenUsed="1"/>
+    <w:lsdException w:name="Table Classic 3" w:semiHidden="1" w:unhideWhenUsed="1"/>
+    <w:lsdException w:name="Table Classic 4" w:semiHidden="1" w:unhideWhenUsed="1"/>
+    <w:lsdException w:name="Table Colorful 1" w:semiHidden="1" w:unhideWhenUsed="1"/>
+    <w:lsdException w:name="Table Colorful 2" w:semiHidden="1" w:unhideWhenUsed="1"/>
+    <w:lsdException w:name="Table Colorful 3" w:semiHidden="1" w:unhideWhenUsed="1"/>
+    <w:lsdException w:name="Table Columns 1" w:semiHidden="1" w:unhideWhenUsed="1"/>
+    <w:lsdException w:name="Table Columns 2" w:semiHidden="1" w:unhideWhenUsed="1"/>
+    <w:lsdException w:name="Table Columns 3" w:semiHidden="1" w:unhideWhenUsed="1"/>
+    <w:lsdException w:name="Table Columns 4" w:semiHidden="1" w:unhideWhenUsed="1"/>
+    <w:lsdException w:name="Table Columns 5" w:semiHidden="1" w:unhideWhenUsed="1"/>
+    <w:lsdException w:name="Table Grid 1" w:semiHidden="1" w:unhideWhenUsed="1"/>
+    <w:lsdException w:name="Table Grid 2" w:semiHidden="1" w:unhideWhenUsed="1"/>
+    <w:lsdException w:name="Table Grid 3" w:semiHidden="1" w:unhideWhenUsed="1"/>
+    <w:lsdException w:name="Table Grid 4" w:semiHidden="1" w:unhideWhenUsed="1"/>
+    <w:lsdException w:name="Table Grid 5" w:semiHidden="1" w:unhideWhenUsed="1"/>
+    <w:lsdException w:name="Table Grid 6" w:semiHidden="1" w:unhideWhenUsed="1"/>
+    <w:lsdException w:name="Table Grid 7" w:semiHidden="1" w:unhideWhenUsed="1"/>
+    <w:lsdException w:name="Table Grid 8" w:semiHidden="1" w:unhideWhenUsed="1"/>
+    <w:lsdException w:name="Table List 1" w:semiHidden="1" w:unhideWhenUsed="1"/>
+    <w:lsdException w:name="Table List 2" w:semiHidden="1" w:unhideWhenUsed="1"/>
+    <w:lsdException w:name="Table List 3" w:semiHidden="1" w:unhideWhenUsed="1"/>
+    <w:lsdException w:name="Table List 4" w:semiHidden="1" w:unhideWhenUsed="1"/>
+    <w:lsdException w:name="Table List 5" w:semiHidden="1" w:unhideWhenUsed="1"/>
+    <w:lsdException w:name="Table List 6" w:semiHidden="1" w:unhideWhenUsed="1"/>
+    <w:lsdException w:name="Table List 7" w:semiHidden="1" w:unhideWhenUsed="1"/>
+    <w:lsdException w:name="Table List 8" w:semiHidden="1" w:unhideWhenUsed="1"/>
+    <w:lsdException w:name="Table 3D effects 1" w:semiHidden="1" w:unhideWhenUsed="1"/>
+    <w:lsdException w:name="Table 3D effects 2" w:semiHidden="1" w:unhideWhenUsed="1"/>
+    <w:lsdException w:name="Table 3D effects 3" w:semiHidden="1" w:unhideWhenUsed="1"/>
+    <w:lsdException w:name="Table Contemporary" w:semiHidden="1" w:unhideWhenUsed="1"/>
+    <w:lsdException w:name="Table Elegant" w:semiHidden="1" w:unhideWhenUsed="1"/>
+    <w:lsdException w:name="Table Professional" w:semiHidden="1" w:unhideWhenUsed="1"/>
+    <w:lsdException w:name="Table Subtle 1" w:semiHidden="1" w:unhideWhenUsed="1"/>
+    <w:lsdException w:name="Table Subtle 2" w:semiHidden="1" w:unhideWhenUsed="1"/>
+    <w:lsdException w:name="Table Web 1" w:semiHidden="1" w:unhideWhenUsed="1"/>
+    <w:lsdException w:name="Table Web 2" w:semiHidden="1" w:unhideWhenUsed="1"/>
+    <w:lsdException w:name="Table Web 3" w:semiHidden="1" w:unhideWhenUsed="1"/>
+    <w:lsdException w:name="Table Theme" w:semiHidden="1" w:unhideWhenUsed="1"/>
+    <w:lsdException w:name="Light Shading"/>
+    <w:lsdException w:name="Light List"/>
+    <w:lsdException w:name="Light Grid"/>
+    <w:lsdException w:name="Medium Shading 1"/>
+    <w:lsdException w:name="Medium Shading 2"/>
+    <w:lsdException w:name="Medium List 1"/>
+    <w:lsdException w:name="Medium List 2"/>
+    <w:lsdException w:name="Medium Grid 1"/>
+    <w:lsdException w:name="Medium Grid 2"/>
+    <w:lsdException w:name="Medium Grid 3"/>
+    <w:lsdException w:name="Dark List"/>
+    <w:lsdException w:name="Colorful Shading"/>
+    <w:lsdException w:name="Colorful List"/>
+    <w:lsdException w:name="Colorful Grid"/>
+    <w:lsdException w:name="Light Shading Accent 1"/>
+    <w:lsdException w:name="Light List Accent 1"/>
+    <w:lsdException w:name="Light Grid Accent 1"/>
+    <w:lsdException w:name="Medium Shading 1 Accent 1"/>
+    <w:lsdException w:name="Medium Shading 2 Accent 1"/>
+    <w:lsdException w:name="Medium List 1 Accent 1"/>
+    <w:lsdException w:name="Medium List 2 Accent 1"/>
+    <w:lsdException w:name="Medium Grid 1 Accent 1"/>
+    <w:lsdException w:name="Medium Grid 2 Accent 1"/>
+    <w:lsdException w:name="Medium Grid 3 Accent 1"/>
+    <w:lsdException w:name="Dark List Accent 1"/>
+    <w:lsdException w:name="Colorful Shading Accent 1"/>
+    <w:lsdException w:name="Colorful List Accent 1"/>
+    <w:lsdException w:name="Colorful Grid Accent 1"/>
+    <w:lsdException w:name="Light Shading Accent 2"/>
+    <w:lsdException w:name="Light List Accent 2"/>
+    <w:lsdException w:name="Light Grid Accent 2"/>
+    <w:lsdException w:name="Medium Shading 1 Accent 2"/>
+    <w:lsdException w:name="Medium Shading 2 Accent 2"/>
+    <w:lsdException w:name="Medium List 1 Accent 2"/>
+    <w:lsdException w:name="Medium List 2 Accent 2"/>
+    <w:lsdException w:name="Medium Grid 1 Accent 2"/>
+    <w:lsdException w:name="Medium Grid 2 Accent 2"/>
+    <w:lsdException w:name="Medium Grid 3 Accent 2"/>
+    <w:lsdException w:name="Dark List Accent 2"/>
+    <w:lsdException w:name="Colorful Shading Accent 2"/>
+    <w:lsdException w:name="Colorful List Accent 2"/>
+    <w:lsdException w:name="Colorful Grid Accent 2"/>
+    <w:lsdException w:name="Light Shading Accent 3"/>
+    <w:lsdException w:name="Light List Accent 3"/>
+    <w:lsdException w:name="Light Grid Accent 3"/>
+    <w:lsdException w:name="Medium Shading 1 Accent 3"/>
+    <w:lsdException w:name="Medium Shading 2 Accent 3"/>
+    <w:lsdException w:name="Medium List 1 Accent 3"/>
+    <w:lsdException w:name="Medium List 2 Accent 3"/>
+    <w:lsdException w:name="Medium Grid 1 Accent 3"/>
+    <w:lsdException w:name="Medium Grid 2 Accent 3"/>
+    <w:lsdException w:name="Medium Grid 3 Accent 3"/>
+    <w:lsdException w:name="Dark List Accent 3"/>
+    <w:lsdException w:name="Colorful Shading Accent 3"/>
+    <w:lsdException w:name="Colorful List Accent 3"/>
+    <w:lsdException w:name="Colorful Grid Accent 3"/>
+    <w:lsdException w:name="Light Shading Accent 4"/>
+    <w:lsdException w:name="Light List Accent 4"/>
+    <w:lsdException w:name="Light Grid Accent 4"/>
+    <w:lsdException w:name="Medium Shading 1 Accent 4"/>
+    <w:lsdException w:name="Medium Shading 2 Accent 4"/>
+    <w:lsdException w:name="Medium List 1 Accent 4"/>
+    <w:lsdException w:name="Medium List 2 Accent 4"/>
+    <w:lsdException w:name="Medium Grid 1 Accent 4"/>
+    <w:lsdException w:name="Medium Grid 2 Accent 4"/>
+    <w:lsdException w:name="Medium Grid 3 Accent 4"/>
+    <w:lsdException w:name="Dark List Accent 4"/>
+    <w:lsdException w:name="Colorful Shading Accent 4"/>
+    <w:lsdException w:name="Colorful List Accent 4"/>
+    <w:lsdException w:name="Colorful Grid Accent 4"/>
+    <w:lsdException w:name="Light Shading Accent 5"/>
+    <w:lsdException w:name="Light List Accent 5"/>
+    <w:lsdException w:name="Light Grid Accent 5"/>
+    <w:lsdException w:name="Medium Shading 1 Accent 5"/>
+    <w:lsdException w:name="Medium Shading 2 Accent 5"/>
+    <w:lsdException w:name="Medium List 1 Accent 5"/>
+    <w:lsdException w:name="Medium List 2 Accent 5"/>
+    <w:lsdException w:name="Medium Grid 1 Accent 5"/>
+    <w:lsdException w:name="Medium Grid 2 Accent 5"/>
+    <w:lsdException w:name="Medium Grid 3 Accent 5"/>
+    <w:lsdException w:name="Dark List Accent 5"/>
+    <w:lsdException w:name="Colorful Shading Accent 5"/>
+    <w:lsdException w:name="Colorful List Accent 5"/>
+    <w:lsdException w:name="Colorful Grid Accent 5"/>
+    <w:lsdException w:name="Light Shading Accent 6"/>
+    <w:lsdException w:name="Light List Accent 6"/>
+    <w:lsdException w:name="Light Grid Accent 6"/>
+    <w:lsdException w:name="Medium Shading 1 Accent 6"/>
+    <w:lsdException w:name="Medium Shading 2 Accent 6"/>
+    <w:lsdException w:name="Medium List 1 Accent 6"/>
+    <w:lsdException w:name="Medium List 2 Accent 6"/>
+    <w:lsdException w:name="Medium Grid 1 Accent 6"/>
+    <w:lsdException w:name="Medium Grid 2 Accent 6"/>
+    <w:lsdException w:name="Medium Grid 3 Accent 6"/>
+    <w:lsdException w:name="Dark List Accent 6"/>
+    <w:lsdException w:name="Colorful Shading Accent 6"/>
+    <w:lsdException w:name="Colorful List Accent 6"/>
+    <w:lsdException w:name="Colorful Grid Accent 6"/>
+    <w:lsdException w:name="Grid Table 4" w:uiPriority="49"/>
+    <w:lsdException w:name="Grid Table 5 Dark" w:uiPriority="50"/>
+    <w:lsdException w:name="Grid Table 6 Colorful" w:uiPriority="51"/>
+    <w:lsdException w:name="Grid Table 7 Colorful" w:uiPriority="52"/>
+    <w:lsdException w:name="Grid Table 1 Light Accent 1" w:uiPriority="46"/>
+    <w:lsdException w:name="Grid Table 2 Accent 1" w:uiPriority="47"/>
+    <w:lsdException w:name="Grid Table 3 Accent 1" w:uiPriority="48"/>
+    <w:lsdException w:name="Grid Table 4 Accent 1" w:uiPriority="49"/>
+    <w:lsdException w:name="Grid Table 5 Dark Accent 1" w:uiPriority="50"/>
+    <w:lsdException w:name="Grid Table 6 Colorful Accent 1" w:uiPriority="51"/>
+    <w:lsdException w:name="Grid Table 7 Colorful Accent 1" w:uiPriority="52"/>
+    <w:lsdException w:name="Grid Table 1 Light Accent 2" w:uiPriority="46"/>
+    <w:lsdException w:name="Grid Table 2 Accent 2" w:uiPriority="47"/>
+    <w:lsdException w:name="Grid Table 3 Accent 2" w:uiPriority="48"/>
+    <w:lsdException w:name="Grid Table 4 Accent 2" w:uiPriority="49"/>
+    <w:lsdException w:name="Grid Table 5 Dark Accent 2" w:uiPriority="50"/>
+    <w:lsdException w:name="Grid Table 6 Colorful Accent 2" w:uiPriority="51"/>
+    <w:lsdException w:name="Grid Table 7 Colorful Accent 2" w:uiPriority="52"/>
+    <w:lsdException w:name="Grid Table 1 Light Accent 3" w:uiPriority="46"/>
+    <w:lsdException w:name="Grid Table 2 Accent 3" w:uiPriority="47"/>
+    <w:lsdException w:name="Grid Table 3 Accent 3" w:uiPriority="48"/>
+    <w:lsdException w:name="Grid Table 4 Accent 3" w:uiPriority="49"/>
+    <w:lsdException w:name="Grid Table 5 Dark Accent 3" w:uiPriority="50"/>
+    <w:lsdException w:name="Grid Table 6 Colorful Accent 3" w:uiPriority="51"/>
+    <w:lsdException w:name="Grid Table 7 Colorful Accent 3" w:uiPriority="52"/>
+    <w:lsdException w:name="Grid Table 1 Light Accent 4" w:uiPriority="46"/>
+    <w:lsdException w:name="Grid Table 2 Accent 4" w:uiPriority="47"/>
+    <w:lsdException w:name="Grid Table 3 Accent 4" w:uiPriority="48"/>
+    <w:lsdException w:name="Grid Table 4 Accent 4" w:uiPriority="49"/>
+    <w:lsdException w:name="Grid Table 5 Dark Accent 4" w:uiPriority="50"/>
+    <w:lsdException w:name="Grid Table 6 Colorful Accent 4" w:uiPriority="51"/>
+    <w:lsdException w:name="Grid Table 7 Colorful Accent 4" w:uiPriority="52"/>
+    <w:lsdException w:name="Grid Table 1 Light Accent 5" w:uiPriority="46"/>
+    <w:lsdException w:name="Grid Table 2 Accent 5" w:uiPriority="47"/>
+    <w:lsdException w:name="Grid Table 3 Accent 5" w:uiPriority="48"/>
+    <w:lsdException w:name="Grid Table 4 Accent 5" w:uiPriority="49"/>
+    <w:lsdException w:name="Grid Table 5 Dark Accent 5" w:uiPriority="50"/>
+    <w:lsdException w:name="Grid Table 6 Colorful Accent 5" w:uiPriority="51"/>
+    <w:lsdException w:name="Grid Table 7 Colorful Accent 5" w:uiPriority="52"/>
+    <w:lsdException w:name="Grid Table 1 Light Accent 6" w:uiPriority="46"/>
+    <w:lsdException w:name="Grid Table 2 Accent 6" w:uiPriority="47"/>
+    <w:lsdException w:name="Grid Table 3 Accent 6" w:uiPriority="48"/>
+    <w:lsdException w:name="Grid Table 4 Accent 6" w:uiPriority="49"/>
+    <w:lsdException w:name="Grid Table 5 Dark Accent 6" w:uiPriority="50"/>
+    <w:lsdException w:name="Grid Table 6 Colorful Accent 6" w:uiPriority="51"/>
+    <w:lsdException w:name="Grid Table 7 Colorful Accent 6" w:uiPriority="52"/>
+    <w:lsdException w:name="List Table 1 Light" w:uiPriority="46"/>
+    <w:lsdException w:name="List Table 2" w:uiPriority="47"/>
+    <w:lsdException w:name="List Table 3" w:uiPriority="48"/>
+    <w:lsdException w:name="List Table 4" w:uiPriority="49"/>
+    <w:lsdException w:name="List Table 5 Dark" w:uiPriority="50"/>
+    <w:lsdException w:name="List Table 6 Colorful" w:uiPriority="51"/>
+    <w:lsdException w:name="List Table 7 Colorful" w:uiPriority="52"/>
+    <w:lsdException w:name="List Table 1 Light Accent 1" w:uiPriority="46"/>
+    <w:lsdException w:name="List Table 2 Accent 1" w:uiPriority="47"/>
+    <w:lsdException w:name="List Table 3 Accent 1" w:uiPriority="48"/>
+    <w:lsdException w:name="List Table 4 Accent 1" w:uiPriority="49"/>
+    <w:lsdException w:name="List Table 5 Dark Accent 1" w:uiPriority="50"/>
+    <w:lsdException w:name="List Table 6 Colorful Accent 1" w:uiPriority="51"/>
+    <w:lsdException w:name="List Table 7 Colorful Accent 1" w:uiPriority="52"/>
+    <w:lsdException w:name="List Table 1 Light Accent 2" w:uiPriority="46"/>
+    <w:lsdException w:name="List Table 2 Accent 2" w:uiPriority="47"/>
+    <w:lsdException w:name="List Table 3 Accent 2" w:uiPriority="48"/>
+    <w:lsdException w:name="List Table 4 Accent 2" w:uiPriority="49"/>
+    <w:lsdException w:name="List Table 5 Dark Accent 2" w:uiPriority="50"/>
+    <w:lsdException w:name="List Table 6 Colorful Accent 2" w:uiPriority="51"/>
+    <w:lsdException w:name="List Table 7 Colorful Accent 2" w:uiPriority="52"/>
+    <w:lsdException w:name="List Table 1 Light Accent 3" w:uiPriority="46"/>
+    <w:lsdException w:name="List Table 2 Accent 3" w:uiPriority="47"/>
+    <w:lsdException w:name="List Table 3 Accent 3" w:uiPriority="48"/>
+    <w:lsdException w:name="List Table 4 Accent 3" w:uiPriority="49"/>
+    <w:lsdException w:name="List Table 5 Dark Accent 3" w:uiPriority="50"/>
+    <w:lsdException w:name="List Table 6 Colorful Accent 3" w:uiPriority="51"/>
+    <w:lsdException w:name="List Table 7 Colorful Accent 3" w:uiPriority="52"/>
+    <w:lsdException w:name="List Table 1 Light Accent 4" w:uiPriority="46"/>
+    <w:lsdException w:name="List Table 2 Accent 4" w:uiPriority="47"/>
+    <w:lsdException w:name="List Table 3 Accent 4" w:uiPriority="48"/>
+    <w:lsdException w:name="List Table 4 Accent 4" w:uiPriority="49"/>
+    <w:lsdException w:name="List Table 5 Dark Accent 4" w:uiPriority="50"/>
+    <w:lsdException w:name="List Table 6 Colorful Accent 4" w:uiPriority="51"/>
+    <w:lsdException w:name="List Table 7 Colorful Accent 4" w:uiPriority="52"/>
+    <w:lsdException w:name="List Table 1 Light Accent 5" w:uiPriority="46"/>
+    <w:lsdException w:name="List Table 2 Accent 5" w:uiPriority="47"/>
+    <w:lsdException w:name="List Table 3 Accent 5" w:uiPriority="48"/>
+    <w:lsdException w:name="List Table 4 Accent 5" w:uiPriority="49"/>
+    <w:lsdException w:name="List Table 5 Dark Accent 5" w:uiPriority="50"/>
+    <w:lsdException w:name="List Table 6 Colorful Accent 5" w:uiPriority="51"/>
+    <w:lsdException w:name="List Table 7 Colorful Accent 5" w:uiPriority="52"/>
+    <w:lsdException w:name="List Table 1 Light Accent 6" w:uiPriority="46"/>
+    <w:lsdException w:name="List Table 2 Accent 6" w:uiPriority="47"/>
+    <w:lsdException w:name="List Table 3 Accent 6" w:uiPriority="48"/>
+    <w:lsdException w:name="List Table 4 Accent 6" w:uiPriority="49"/>
+    <w:lsdException w:name="List Table 5 Dark Accent 6" w:uiPriority="50"/>
+    <w:lsdException w:name="List Table 6 Colorful Accent 6" w:uiPriority="51"/>
+    <w:lsdException w:name="List Table 7 Colorful Accent 6" w:uiPriority="52"/>
+    <w:lsdException w:name="Mention" w:semiHidden="1" w:uiPriority="99" w:unhideWhenUsed="1"/>
+    <w:lsdException w:name="Smart Hyperlink" w:semiHidden="1" w:uiPriority="99" w:unhideWhenUsed="1"/>
+    <w:lsdException w:name="Hashtag" w:semiHidden="1" w:uiPriority="99" w:unhideWhenUsed="1"/>
+    <w:lsdException w:name="Unresolved Mention" w:semiHidden="1" w:uiPriority="99" w:unhideWhenUsed="1"/>
+    <w:lsdException w:name="Smart Link" w:semiHidden="1" w:uiPriority="99" w:unhideWhenUsed="1"/>
+  </w:latentStyles>
+  <w:style w:type="paragraph" w:default="1" w:styleId="Normal">
     <w:name w:val="Normal"/>
     <w:qFormat/>
   </w:style>
-  <w:style w:styleId="BodyText" w:type="paragraph">
-    <w:name w:val="Body Text"/>
-    <w:basedOn w:val="Normal"/>
-    <w:link w:val="BodyTextChar"/>
-    <w:qFormat/>
-    <w:pPr>
-      <w:spacing w:after="180" w:before="180"/>
-    </w:pPr>
-  </w:style>
-  <w:style w:customStyle="1" w:styleId="FirstParagraph" w:type="paragraph">
-    <w:name w:val="First Paragraph"/>
-    <w:basedOn w:val="BodyText"/>
-    <w:next w:val="BodyText"/>
-    <w:qFormat/>
-  </w:style>
-  <w:style w:customStyle="1" w:styleId="Compact" w:type="paragraph">
-    <w:name w:val="Compact"/>
-    <w:basedOn w:val="BodyText"/>
-    <w:qFormat/>
-    <w:pPr>
-      <w:spacing w:after="36" w:before="36"/>
-    </w:pPr>
-  </w:style>
-  <w:style w:styleId="Title" w:type="paragraph">
-    <w:name w:val="Title"/>
-    <w:basedOn w:val="Normal"/>
-    <w:next w:val="BodyText"/>
-    <w:link w:val="TitleChar"/>
-    <w:uiPriority w:val="10"/>
-    <w:qFormat/>
-    <w:rsid w:val="00A10FD9"/>
-    <w:pPr>
-      <w:spacing w:after="80" w:line="240" w:lineRule="auto"/>
-      <w:contextualSpacing/>
-      <w:jc w:val="center"/>
-    </w:pPr>
-    <w:rPr>
-      <w:rFonts w:asciiTheme="majorHAnsi" w:cstheme="majorBidi" w:eastAsiaTheme="majorEastAsia" w:hAnsiTheme="majorHAnsi"/>
-      <w:sz w:val="56"/>
-      <w:szCs w:val="56"/>
-    </w:rPr>
-  </w:style>
-  <w:style w:customStyle="1" w:styleId="TitleChar" w:type="character">
-    <w:name w:val="Title Char"/>
-    <w:basedOn w:val="DefaultParagraphFont"/>
-    <w:link w:val="Title"/>
-    <w:uiPriority w:val="10"/>
-    <w:rsid w:val="00A10FD9"/>
-    <w:rPr>
-      <w:rFonts w:asciiTheme="majorHAnsi" w:cstheme="majorBidi" w:eastAsiaTheme="majorEastAsia" w:hAnsiTheme="majorHAnsi"/>
-      <w:sz w:val="56"/>
-      <w:szCs w:val="56"/>
-    </w:rPr>
-  </w:style>
-  <w:style w:styleId="Subtitle" w:type="paragraph">
-    <w:name w:val="Subtitle"/>
-    <w:basedOn w:val="Title"/>
-    <w:next w:val="BodyText"/>
-    <w:link w:val="SubtitleChar"/>
-    <w:uiPriority w:val="11"/>
-    <w:qFormat/>
-    <w:rsid w:val="00A10FD9"/>
-    <w:pPr>
-      <w:numPr>
-        <w:ilvl w:val="1"/>
-      </w:numPr>
-    </w:pPr>
-    <w:rPr>
-      <w:rFonts w:cstheme="majorBidi" w:eastAsiaTheme="majorEastAsia"/>
-      <w:spacing w:val="15"/>
-      <w:sz w:val="28"/>
-      <w:szCs w:val="28"/>
-    </w:rPr>
-  </w:style>
-  <w:style w:customStyle="1" w:styleId="SubtitleChar" w:type="character">
-    <w:name w:val="Subtitle Char"/>
-    <w:basedOn w:val="DefaultParagraphFont"/>
-    <w:link w:val="Subtitle"/>
-    <w:uiPriority w:val="11"/>
-    <w:rsid w:val="00A10FD9"/>
-    <w:rPr>
-      <w:rFonts w:cstheme="majorBidi" w:eastAsiaTheme="majorEastAsia"/>
-      <w:color w:themeColor="text1" w:themeTint="A6" w:val="595959"/>
-      <w:spacing w:val="15"/>
-      <w:sz w:val="28"/>
-      <w:szCs w:val="28"/>
-    </w:rPr>
-  </w:style>
-  <w:style w:customStyle="1" w:styleId="Author" w:type="paragraph">
-    <w:name w:val="Author"/>
-    <w:basedOn w:val="Title"/>
-    <w:next w:val="BodyText"/>
-    <w:qFormat/>
-    <w:pPr>
-      <w:keepNext/>
-      <w:keepLines/>
-    </w:pPr>
-    <w:rPr>
-      <w:sz w:val="24"/>
-      <w:szCs w:val="24"/>
-    </w:rPr>
-  </w:style>
-  <w:style w:styleId="Date" w:type="paragraph">
-    <w:name w:val="Date"/>
-    <w:basedOn w:val="Title"/>
-    <w:next w:val="BodyText"/>
-    <w:qFormat/>
-    <w:pPr>
-      <w:keepNext/>
-      <w:keepLines/>
-    </w:pPr>
-    <w:rPr>
-      <w:sz w:val="24"/>
-      <w:szCs w:val="24"/>
-    </w:rPr>
-  </w:style>
-  <w:style w:customStyle="1" w:styleId="AbstractTitle" w:type="paragraph">
-    <w:name w:val="Abstract Title"/>
-    <w:basedOn w:val="Normal"/>
-    <w:next w:val="Abstract"/>
-    <w:qFormat/>
-    <w:pPr>
-      <w:keepNext/>
-      <w:keepLines/>
-      <w:spacing w:after="0" w:before="300"/>
-      <w:jc w:val="center"/>
-    </w:pPr>
-    <w:rPr>
-      <w:b/>
-      <w:sz w:val="20"/>
-      <w:szCs w:val="20"/>
-    </w:rPr>
-  </w:style>
-  <w:style w:customStyle="1" w:styleId="Abstract" w:type="paragraph">
-    <w:name w:val="Abstract"/>
-    <w:basedOn w:val="Normal"/>
-    <w:next w:val="BodyText"/>
-    <w:qFormat/>
-    <w:pPr>
-      <w:keepNext/>
-      <w:keepLines/>
-      <w:spacing w:after="300" w:before="100"/>
-    </w:pPr>
-    <w:rPr>
-      <w:sz w:val="20"/>
-      <w:szCs w:val="20"/>
-    </w:rPr>
-  </w:style>
-  <w:style w:styleId="Bibliography" w:type="paragraph">
-    <w:name w:val="Bibliography"/>
-    <w:basedOn w:val="Normal"/>
-    <w:next w:val="Bibliography"/>
-    <w:qFormat/>
-    <w:pPr/>
-    <w:rPr/>
-  </w:style>
-  <w:style w:styleId="Heading1" w:type="paragraph">
+  <w:style w:type="paragraph" w:styleId="Heading1">
     <w:name w:val="heading 1"/>
     <w:basedOn w:val="Normal"/>
     <w:next w:val="BodyText"/>
@@ -2118,17 +2162,17 @@
     <w:pPr>
       <w:keepNext/>
       <w:keepLines/>
-      <w:spacing w:after="80" w:before="360"/>
+      <w:spacing w:before="360" w:after="80"/>
       <w:outlineLvl w:val="0"/>
     </w:pPr>
     <w:rPr>
-      <w:rFonts w:asciiTheme="majorHAnsi" w:cstheme="majorBidi" w:eastAsiaTheme="majorEastAsia" w:hAnsiTheme="majorHAnsi"/>
-      <w:color w:themeColor="accent1" w:themeShade="BF" w:val="0F4761"/>
+      <w:rFonts w:asciiTheme="majorHAnsi" w:eastAsiaTheme="majorEastAsia" w:hAnsiTheme="majorHAnsi" w:cstheme="majorBidi"/>
+      <w:color w:val="0F4761" w:themeColor="accent1" w:themeShade="BF"/>
       <w:sz w:val="40"/>
       <w:szCs w:val="40"/>
     </w:rPr>
   </w:style>
-  <w:style w:styleId="Heading2" w:type="paragraph">
+  <w:style w:type="paragraph" w:styleId="Heading2">
     <w:name w:val="heading 2"/>
     <w:basedOn w:val="Normal"/>
     <w:next w:val="BodyText"/>
@@ -2141,17 +2185,17 @@
     <w:pPr>
       <w:keepNext/>
       <w:keepLines/>
-      <w:spacing w:after="80" w:before="160"/>
+      <w:spacing w:before="160" w:after="80"/>
       <w:outlineLvl w:val="1"/>
     </w:pPr>
     <w:rPr>
-      <w:rFonts w:asciiTheme="majorHAnsi" w:cstheme="majorBidi" w:eastAsiaTheme="majorEastAsia" w:hAnsiTheme="majorHAnsi"/>
-      <w:color w:themeColor="accent1" w:themeShade="BF" w:val="0F4761"/>
+      <w:rFonts w:asciiTheme="majorHAnsi" w:eastAsiaTheme="majorEastAsia" w:hAnsiTheme="majorHAnsi" w:cstheme="majorBidi"/>
+      <w:color w:val="0F4761" w:themeColor="accent1" w:themeShade="BF"/>
       <w:sz w:val="32"/>
       <w:szCs w:val="32"/>
     </w:rPr>
   </w:style>
-  <w:style w:styleId="Heading3" w:type="paragraph">
+  <w:style w:type="paragraph" w:styleId="Heading3">
     <w:name w:val="heading 3"/>
     <w:basedOn w:val="Normal"/>
     <w:next w:val="BodyText"/>
@@ -2164,17 +2208,17 @@
     <w:pPr>
       <w:keepNext/>
       <w:keepLines/>
-      <w:spacing w:after="80" w:before="160"/>
+      <w:spacing w:before="160" w:after="80"/>
       <w:outlineLvl w:val="2"/>
     </w:pPr>
     <w:rPr>
-      <w:rFonts w:cstheme="majorBidi" w:eastAsiaTheme="majorEastAsia"/>
-      <w:color w:themeColor="accent1" w:themeShade="BF" w:val="0F4761"/>
+      <w:rFonts w:eastAsiaTheme="majorEastAsia" w:cstheme="majorBidi"/>
+      <w:color w:val="0F4761" w:themeColor="accent1" w:themeShade="BF"/>
       <w:sz w:val="28"/>
       <w:szCs w:val="28"/>
     </w:rPr>
   </w:style>
-  <w:style w:styleId="Heading4" w:type="paragraph">
+  <w:style w:type="paragraph" w:styleId="Heading4">
     <w:name w:val="heading 4"/>
     <w:basedOn w:val="Normal"/>
     <w:next w:val="BodyText"/>
@@ -2187,17 +2231,17 @@
     <w:pPr>
       <w:keepNext/>
       <w:keepLines/>
-      <w:spacing w:after="40" w:before="80"/>
+      <w:spacing w:before="80" w:after="40"/>
       <w:outlineLvl w:val="3"/>
     </w:pPr>
     <w:rPr>
-      <w:rFonts w:cstheme="majorBidi" w:eastAsiaTheme="majorEastAsia"/>
+      <w:rFonts w:eastAsiaTheme="majorEastAsia" w:cstheme="majorBidi"/>
       <w:i/>
       <w:iCs/>
-      <w:color w:themeColor="accent1" w:themeShade="BF" w:val="0F4761"/>
-    </w:rPr>
-  </w:style>
-  <w:style w:styleId="Heading5" w:type="paragraph">
+      <w:color w:val="0F4761" w:themeColor="accent1" w:themeShade="BF"/>
+    </w:rPr>
+  </w:style>
+  <w:style w:type="paragraph" w:styleId="Heading5">
     <w:name w:val="heading 5"/>
     <w:basedOn w:val="Normal"/>
     <w:next w:val="BodyText"/>
@@ -2210,15 +2254,15 @@
     <w:pPr>
       <w:keepNext/>
       <w:keepLines/>
-      <w:spacing w:after="40" w:before="80"/>
+      <w:spacing w:before="80" w:after="40"/>
       <w:outlineLvl w:val="4"/>
     </w:pPr>
     <w:rPr>
-      <w:rFonts w:cstheme="majorBidi" w:eastAsiaTheme="majorEastAsia"/>
-      <w:color w:themeColor="accent1" w:themeShade="BF" w:val="0F4761"/>
-    </w:rPr>
-  </w:style>
-  <w:style w:styleId="Heading6" w:type="paragraph">
+      <w:rFonts w:eastAsiaTheme="majorEastAsia" w:cstheme="majorBidi"/>
+      <w:color w:val="0F4761" w:themeColor="accent1" w:themeShade="BF"/>
+    </w:rPr>
+  </w:style>
+  <w:style w:type="paragraph" w:styleId="Heading6">
     <w:name w:val="heading 6"/>
     <w:basedOn w:val="Normal"/>
     <w:next w:val="BodyText"/>
@@ -2231,17 +2275,17 @@
     <w:pPr>
       <w:keepNext/>
       <w:keepLines/>
-      <w:spacing w:after="0" w:before="40"/>
+      <w:spacing w:before="40" w:after="0"/>
       <w:outlineLvl w:val="5"/>
     </w:pPr>
     <w:rPr>
-      <w:rFonts w:cstheme="majorBidi" w:eastAsiaTheme="majorEastAsia"/>
+      <w:rFonts w:eastAsiaTheme="majorEastAsia" w:cstheme="majorBidi"/>
       <w:i/>
       <w:iCs/>
-      <w:color w:themeColor="text1" w:themeTint="A6" w:val="595959"/>
-    </w:rPr>
-  </w:style>
-  <w:style w:styleId="Heading7" w:type="paragraph">
+      <w:color w:val="595959" w:themeColor="text1" w:themeTint="A6"/>
+    </w:rPr>
+  </w:style>
+  <w:style w:type="paragraph" w:styleId="Heading7">
     <w:name w:val="heading 7"/>
     <w:basedOn w:val="Normal"/>
     <w:next w:val="BodyText"/>
@@ -2254,15 +2298,15 @@
     <w:pPr>
       <w:keepNext/>
       <w:keepLines/>
-      <w:spacing w:after="0" w:before="40"/>
+      <w:spacing w:before="40" w:after="0"/>
       <w:outlineLvl w:val="6"/>
     </w:pPr>
     <w:rPr>
-      <w:rFonts w:cstheme="majorBidi" w:eastAsiaTheme="majorEastAsia"/>
-      <w:color w:themeColor="text1" w:themeTint="A6" w:val="595959"/>
-    </w:rPr>
-  </w:style>
-  <w:style w:styleId="Heading8" w:type="paragraph">
+      <w:rFonts w:eastAsiaTheme="majorEastAsia" w:cstheme="majorBidi"/>
+      <w:color w:val="595959" w:themeColor="text1" w:themeTint="A6"/>
+    </w:rPr>
+  </w:style>
+  <w:style w:type="paragraph" w:styleId="Heading8">
     <w:name w:val="heading 8"/>
     <w:basedOn w:val="Normal"/>
     <w:next w:val="BodyText"/>
@@ -2279,13 +2323,13 @@
       <w:outlineLvl w:val="7"/>
     </w:pPr>
     <w:rPr>
-      <w:rFonts w:cstheme="majorBidi" w:eastAsiaTheme="majorEastAsia"/>
+      <w:rFonts w:eastAsiaTheme="majorEastAsia" w:cstheme="majorBidi"/>
       <w:i/>
       <w:iCs/>
-      <w:color w:themeColor="text1" w:themeTint="D8" w:val="272727"/>
-    </w:rPr>
-  </w:style>
-  <w:style w:styleId="Heading9" w:type="paragraph">
+      <w:color w:val="272727" w:themeColor="text1" w:themeTint="D8"/>
+    </w:rPr>
+  </w:style>
+  <w:style w:type="paragraph" w:styleId="Heading9">
     <w:name w:val="heading 9"/>
     <w:basedOn w:val="Normal"/>
     <w:next w:val="BodyText"/>
@@ -2302,24 +2346,202 @@
       <w:outlineLvl w:val="8"/>
     </w:pPr>
     <w:rPr>
-      <w:rFonts w:cstheme="majorBidi" w:eastAsiaTheme="majorEastAsia"/>
-      <w:color w:themeColor="text1" w:themeTint="D8" w:val="272727"/>
-    </w:rPr>
-  </w:style>
-  <w:style w:customStyle="1" w:styleId="Heading1Char" w:type="character">
+      <w:rFonts w:eastAsiaTheme="majorEastAsia" w:cstheme="majorBidi"/>
+      <w:color w:val="272727" w:themeColor="text1" w:themeTint="D8"/>
+    </w:rPr>
+  </w:style>
+  <w:style w:type="character" w:default="1" w:styleId="DefaultParagraphFont">
+    <w:name w:val="Default Paragraph Font"/>
+    <w:uiPriority w:val="1"/>
+    <w:semiHidden/>
+    <w:unhideWhenUsed/>
+  </w:style>
+  <w:style w:type="table" w:default="1" w:styleId="TableNormal">
+    <w:name w:val="Normal Table"/>
+    <w:uiPriority w:val="99"/>
+    <w:semiHidden/>
+    <w:unhideWhenUsed/>
+    <w:tblPr>
+      <w:tblInd w:w="0" w:type="dxa"/>
+      <w:tblCellMar>
+        <w:top w:w="0" w:type="dxa"/>
+        <w:left w:w="108" w:type="dxa"/>
+        <w:bottom w:w="0" w:type="dxa"/>
+        <w:right w:w="108" w:type="dxa"/>
+      </w:tblCellMar>
+    </w:tblPr>
+  </w:style>
+  <w:style w:type="numbering" w:default="1" w:styleId="NoList">
+    <w:name w:val="No List"/>
+    <w:uiPriority w:val="99"/>
+    <w:semiHidden/>
+    <w:unhideWhenUsed/>
+  </w:style>
+  <w:style w:type="paragraph" w:styleId="BodyText">
+    <w:name w:val="Body Text"/>
+    <w:basedOn w:val="Normal"/>
+    <w:qFormat/>
+    <w:pPr>
+      <w:spacing w:before="180" w:after="180"/>
+    </w:pPr>
+  </w:style>
+  <w:style w:type="paragraph" w:customStyle="1" w:styleId="FirstParagraph">
+    <w:name w:val="First Paragraph"/>
+    <w:basedOn w:val="BodyText"/>
+    <w:next w:val="BodyText"/>
+    <w:qFormat/>
+  </w:style>
+  <w:style w:type="paragraph" w:customStyle="1" w:styleId="Compact">
+    <w:name w:val="Compact"/>
+    <w:basedOn w:val="BodyText"/>
+    <w:qFormat/>
+    <w:pPr>
+      <w:spacing w:before="36" w:after="36"/>
+    </w:pPr>
+  </w:style>
+  <w:style w:type="paragraph" w:styleId="Title">
+    <w:name w:val="Title"/>
+    <w:basedOn w:val="Normal"/>
+    <w:next w:val="BodyText"/>
+    <w:link w:val="TitleChar"/>
+    <w:uiPriority w:val="10"/>
+    <w:qFormat/>
+    <w:rsid w:val="00A10FD9"/>
+    <w:pPr>
+      <w:spacing w:after="80"/>
+      <w:contextualSpacing/>
+      <w:jc w:val="center"/>
+    </w:pPr>
+    <w:rPr>
+      <w:rFonts w:asciiTheme="majorHAnsi" w:eastAsiaTheme="majorEastAsia" w:hAnsiTheme="majorHAnsi" w:cstheme="majorBidi"/>
+      <w:sz w:val="56"/>
+      <w:szCs w:val="56"/>
+    </w:rPr>
+  </w:style>
+  <w:style w:type="character" w:customStyle="1" w:styleId="TitleChar">
+    <w:name w:val="Title Char"/>
+    <w:basedOn w:val="DefaultParagraphFont"/>
+    <w:link w:val="Title"/>
+    <w:uiPriority w:val="10"/>
+    <w:rsid w:val="00A10FD9"/>
+    <w:rPr>
+      <w:rFonts w:asciiTheme="majorHAnsi" w:eastAsiaTheme="majorEastAsia" w:hAnsiTheme="majorHAnsi" w:cstheme="majorBidi"/>
+      <w:sz w:val="56"/>
+      <w:szCs w:val="56"/>
+    </w:rPr>
+  </w:style>
+  <w:style w:type="paragraph" w:styleId="Subtitle">
+    <w:name w:val="Subtitle"/>
+    <w:basedOn w:val="Title"/>
+    <w:next w:val="BodyText"/>
+    <w:link w:val="SubtitleChar"/>
+    <w:uiPriority w:val="11"/>
+    <w:qFormat/>
+    <w:rsid w:val="00A10FD9"/>
+    <w:pPr>
+      <w:numPr>
+        <w:ilvl w:val="1"/>
+      </w:numPr>
+    </w:pPr>
+    <w:rPr>
+      <w:spacing w:val="15"/>
+      <w:sz w:val="28"/>
+      <w:szCs w:val="28"/>
+    </w:rPr>
+  </w:style>
+  <w:style w:type="character" w:customStyle="1" w:styleId="SubtitleChar">
+    <w:name w:val="Subtitle Char"/>
+    <w:basedOn w:val="DefaultParagraphFont"/>
+    <w:link w:val="Subtitle"/>
+    <w:uiPriority w:val="11"/>
+    <w:rsid w:val="00A10FD9"/>
+    <w:rPr>
+      <w:rFonts w:eastAsiaTheme="majorEastAsia" w:cstheme="majorBidi"/>
+      <w:color w:val="595959" w:themeColor="text1" w:themeTint="A6"/>
+      <w:spacing w:val="15"/>
+      <w:sz w:val="28"/>
+      <w:szCs w:val="28"/>
+    </w:rPr>
+  </w:style>
+  <w:style w:type="paragraph" w:customStyle="1" w:styleId="Author">
+    <w:name w:val="Author"/>
+    <w:basedOn w:val="Title"/>
+    <w:next w:val="BodyText"/>
+    <w:qFormat/>
+    <w:pPr>
+      <w:keepNext/>
+      <w:keepLines/>
+    </w:pPr>
+    <w:rPr>
+      <w:sz w:val="24"/>
+      <w:szCs w:val="24"/>
+    </w:rPr>
+  </w:style>
+  <w:style w:type="paragraph" w:styleId="Date">
+    <w:name w:val="Date"/>
+    <w:basedOn w:val="Title"/>
+    <w:next w:val="BodyText"/>
+    <w:qFormat/>
+    <w:pPr>
+      <w:keepNext/>
+      <w:keepLines/>
+    </w:pPr>
+    <w:rPr>
+      <w:sz w:val="24"/>
+      <w:szCs w:val="24"/>
+    </w:rPr>
+  </w:style>
+  <w:style w:type="paragraph" w:customStyle="1" w:styleId="AbstractTitle">
+    <w:name w:val="Abstract Title"/>
+    <w:basedOn w:val="Normal"/>
+    <w:next w:val="Abstract"/>
+    <w:qFormat/>
+    <w:pPr>
+      <w:keepNext/>
+      <w:keepLines/>
+      <w:spacing w:before="300" w:after="0"/>
+      <w:jc w:val="center"/>
+    </w:pPr>
+    <w:rPr>
+      <w:b/>
+      <w:sz w:val="20"/>
+      <w:szCs w:val="20"/>
+    </w:rPr>
+  </w:style>
+  <w:style w:type="paragraph" w:customStyle="1" w:styleId="Abstract">
+    <w:name w:val="Abstract"/>
+    <w:basedOn w:val="Normal"/>
+    <w:next w:val="BodyText"/>
+    <w:qFormat/>
+    <w:pPr>
+      <w:keepNext/>
+      <w:keepLines/>
+      <w:spacing w:before="100" w:after="300"/>
+    </w:pPr>
+    <w:rPr>
+      <w:sz w:val="20"/>
+      <w:szCs w:val="20"/>
+    </w:rPr>
+  </w:style>
+  <w:style w:type="paragraph" w:styleId="Bibliography">
+    <w:name w:val="Bibliography"/>
+    <w:basedOn w:val="Normal"/>
+    <w:qFormat/>
+  </w:style>
+  <w:style w:type="character" w:customStyle="1" w:styleId="Heading1Char">
     <w:name w:val="Heading 1 Char"/>
     <w:basedOn w:val="DefaultParagraphFont"/>
     <w:link w:val="Heading1"/>
     <w:uiPriority w:val="9"/>
     <w:rsid w:val="00A10FD9"/>
     <w:rPr>
-      <w:rFonts w:asciiTheme="majorHAnsi" w:cstheme="majorBidi" w:eastAsiaTheme="majorEastAsia" w:hAnsiTheme="majorHAnsi"/>
-      <w:color w:themeColor="accent1" w:themeShade="BF" w:val="0F4761"/>
+      <w:rFonts w:asciiTheme="majorHAnsi" w:eastAsiaTheme="majorEastAsia" w:hAnsiTheme="majorHAnsi" w:cstheme="majorBidi"/>
+      <w:color w:val="0F4761" w:themeColor="accent1" w:themeShade="BF"/>
       <w:sz w:val="40"/>
       <w:szCs w:val="40"/>
     </w:rPr>
   </w:style>
-  <w:style w:customStyle="1" w:styleId="Heading2Char" w:type="character">
+  <w:style w:type="character" w:customStyle="1" w:styleId="Heading2Char">
     <w:name w:val="Heading 2 Char"/>
     <w:basedOn w:val="DefaultParagraphFont"/>
     <w:link w:val="Heading2"/>
@@ -2327,13 +2549,13 @@
     <w:semiHidden/>
     <w:rsid w:val="00A10FD9"/>
     <w:rPr>
-      <w:rFonts w:asciiTheme="majorHAnsi" w:cstheme="majorBidi" w:eastAsiaTheme="majorEastAsia" w:hAnsiTheme="majorHAnsi"/>
-      <w:color w:themeColor="accent1" w:themeShade="BF" w:val="0F4761"/>
+      <w:rFonts w:asciiTheme="majorHAnsi" w:eastAsiaTheme="majorEastAsia" w:hAnsiTheme="majorHAnsi" w:cstheme="majorBidi"/>
+      <w:color w:val="0F4761" w:themeColor="accent1" w:themeShade="BF"/>
       <w:sz w:val="32"/>
       <w:szCs w:val="32"/>
     </w:rPr>
   </w:style>
-  <w:style w:customStyle="1" w:styleId="Heading3Char" w:type="character">
+  <w:style w:type="character" w:customStyle="1" w:styleId="Heading3Char">
     <w:name w:val="Heading 3 Char"/>
     <w:basedOn w:val="DefaultParagraphFont"/>
     <w:link w:val="Heading3"/>
@@ -2341,13 +2563,13 @@
     <w:semiHidden/>
     <w:rsid w:val="00A10FD9"/>
     <w:rPr>
-      <w:rFonts w:cstheme="majorBidi" w:eastAsiaTheme="majorEastAsia"/>
-      <w:color w:themeColor="accent1" w:themeShade="BF" w:val="0F4761"/>
+      <w:rFonts w:eastAsiaTheme="majorEastAsia" w:cstheme="majorBidi"/>
+      <w:color w:val="0F4761" w:themeColor="accent1" w:themeShade="BF"/>
       <w:sz w:val="28"/>
       <w:szCs w:val="28"/>
     </w:rPr>
   </w:style>
-  <w:style w:customStyle="1" w:styleId="Heading4Char" w:type="character">
+  <w:style w:type="character" w:customStyle="1" w:styleId="Heading4Char">
     <w:name w:val="Heading 4 Char"/>
     <w:basedOn w:val="DefaultParagraphFont"/>
     <w:link w:val="Heading4"/>
@@ -2355,13 +2577,13 @@
     <w:semiHidden/>
     <w:rsid w:val="00A10FD9"/>
     <w:rPr>
-      <w:rFonts w:cstheme="majorBidi" w:eastAsiaTheme="majorEastAsia"/>
+      <w:rFonts w:eastAsiaTheme="majorEastAsia" w:cstheme="majorBidi"/>
       <w:i/>
       <w:iCs/>
-      <w:color w:themeColor="accent1" w:themeShade="BF" w:val="0F4761"/>
-    </w:rPr>
-  </w:style>
-  <w:style w:customStyle="1" w:styleId="Heading5Char" w:type="character">
+      <w:color w:val="0F4761" w:themeColor="accent1" w:themeShade="BF"/>
+    </w:rPr>
+  </w:style>
+  <w:style w:type="character" w:customStyle="1" w:styleId="Heading5Char">
     <w:name w:val="Heading 5 Char"/>
     <w:basedOn w:val="DefaultParagraphFont"/>
     <w:link w:val="Heading5"/>
@@ -2369,11 +2591,11 @@
     <w:semiHidden/>
     <w:rsid w:val="00A10FD9"/>
     <w:rPr>
-      <w:rFonts w:cstheme="majorBidi" w:eastAsiaTheme="majorEastAsia"/>
-      <w:color w:themeColor="accent1" w:themeShade="BF" w:val="0F4761"/>
-    </w:rPr>
-  </w:style>
-  <w:style w:customStyle="1" w:styleId="Heading6Char" w:type="character">
+      <w:rFonts w:eastAsiaTheme="majorEastAsia" w:cstheme="majorBidi"/>
+      <w:color w:val="0F4761" w:themeColor="accent1" w:themeShade="BF"/>
+    </w:rPr>
+  </w:style>
+  <w:style w:type="character" w:customStyle="1" w:styleId="Heading6Char">
     <w:name w:val="Heading 6 Char"/>
     <w:basedOn w:val="DefaultParagraphFont"/>
     <w:link w:val="Heading6"/>
@@ -2381,13 +2603,13 @@
     <w:semiHidden/>
     <w:rsid w:val="00A10FD9"/>
     <w:rPr>
-      <w:rFonts w:cstheme="majorBidi" w:eastAsiaTheme="majorEastAsia"/>
+      <w:rFonts w:eastAsiaTheme="majorEastAsia" w:cstheme="majorBidi"/>
       <w:i/>
       <w:iCs/>
-      <w:color w:themeColor="text1" w:themeTint="A6" w:val="595959"/>
-    </w:rPr>
-  </w:style>
-  <w:style w:customStyle="1" w:styleId="Heading7Char" w:type="character">
+      <w:color w:val="595959" w:themeColor="text1" w:themeTint="A6"/>
+    </w:rPr>
+  </w:style>
+  <w:style w:type="character" w:customStyle="1" w:styleId="Heading7Char">
     <w:name w:val="Heading 7 Char"/>
     <w:basedOn w:val="DefaultParagraphFont"/>
     <w:link w:val="Heading7"/>
@@ -2395,11 +2617,11 @@
     <w:semiHidden/>
     <w:rsid w:val="00A10FD9"/>
     <w:rPr>
-      <w:rFonts w:cstheme="majorBidi" w:eastAsiaTheme="majorEastAsia"/>
-      <w:color w:themeColor="text1" w:themeTint="A6" w:val="595959"/>
-    </w:rPr>
-  </w:style>
-  <w:style w:customStyle="1" w:styleId="Heading8Char" w:type="character">
+      <w:rFonts w:eastAsiaTheme="majorEastAsia" w:cstheme="majorBidi"/>
+      <w:color w:val="595959" w:themeColor="text1" w:themeTint="A6"/>
+    </w:rPr>
+  </w:style>
+  <w:style w:type="character" w:customStyle="1" w:styleId="Heading8Char">
     <w:name w:val="Heading 8 Char"/>
     <w:basedOn w:val="DefaultParagraphFont"/>
     <w:link w:val="Heading8"/>
@@ -2407,13 +2629,13 @@
     <w:semiHidden/>
     <w:rsid w:val="00A10FD9"/>
     <w:rPr>
-      <w:rFonts w:cstheme="majorBidi" w:eastAsiaTheme="majorEastAsia"/>
+      <w:rFonts w:eastAsiaTheme="majorEastAsia" w:cstheme="majorBidi"/>
       <w:i/>
       <w:iCs/>
-      <w:color w:themeColor="text1" w:themeTint="D8" w:val="272727"/>
-    </w:rPr>
-  </w:style>
-  <w:style w:customStyle="1" w:styleId="Heading9Char" w:type="character">
+      <w:color w:val="272727" w:themeColor="text1" w:themeTint="D8"/>
+    </w:rPr>
+  </w:style>
+  <w:style w:type="character" w:customStyle="1" w:styleId="Heading9Char">
     <w:name w:val="Heading 9 Char"/>
     <w:basedOn w:val="DefaultParagraphFont"/>
     <w:link w:val="Heading9"/>
@@ -2421,11 +2643,11 @@
     <w:semiHidden/>
     <w:rsid w:val="00A10FD9"/>
     <w:rPr>
-      <w:rFonts w:cstheme="majorBidi" w:eastAsiaTheme="majorEastAsia"/>
-      <w:color w:themeColor="text1" w:themeTint="D8" w:val="272727"/>
-    </w:rPr>
-  </w:style>
-  <w:style w:styleId="BlockText" w:type="paragraph">
+      <w:rFonts w:eastAsiaTheme="majorEastAsia" w:cstheme="majorBidi"/>
+      <w:color w:val="272727" w:themeColor="text1" w:themeTint="D8"/>
+    </w:rPr>
+  </w:style>
+  <w:style w:type="paragraph" w:styleId="BlockText">
     <w:name w:val="Block Text"/>
     <w:basedOn w:val="BodyText"/>
     <w:next w:val="BodyText"/>
@@ -2433,19 +2655,18 @@
     <w:unhideWhenUsed/>
     <w:qFormat/>
     <w:pPr>
-      <w:spacing w:after="100" w:before="100"/>
-      <w:ind w:firstLine="0" w:left="480" w:right="480"/>
+      <w:spacing w:before="100" w:after="100"/>
+      <w:ind w:left="480" w:right="480"/>
     </w:pPr>
   </w:style>
-  <w:style w:styleId="FootnoteText" w:type="paragraph">
-    <w:name w:val="Footnote Text"/>
+  <w:style w:type="paragraph" w:styleId="FootnoteText">
+    <w:name w:val="footnote text"/>
     <w:basedOn w:val="Normal"/>
-    <w:next w:val="FootnoteText"/>
     <w:uiPriority w:val="9"/>
     <w:unhideWhenUsed/>
     <w:qFormat/>
   </w:style>
-  <w:style w:styleId="FootnoteBlockText" w:type="paragraph">
+  <w:style w:type="paragraph" w:customStyle="1" w:styleId="FootnoteBlockText">
     <w:name w:val="Footnote Block Text"/>
     <w:basedOn w:val="FootnoteText"/>
     <w:next w:val="FootnoteText"/>
@@ -2453,40 +2674,35 @@
     <w:unhideWhenUsed/>
     <w:qFormat/>
     <w:pPr>
-      <w:spacing w:after="100" w:before="100"/>
-      <w:ind w:firstLine="0" w:left="480" w:right="480"/>
+      <w:spacing w:before="100" w:after="100"/>
+      <w:ind w:left="480" w:right="480"/>
     </w:pPr>
   </w:style>
-  <w:style w:default="1" w:styleId="DefaultParagraphFont" w:type="character">
-    <w:name w:val="Default Paragraph Font"/>
-    <w:semiHidden/>
-    <w:unhideWhenUsed/>
-  </w:style>
-  <w:style w:default="1" w:styleId="Table" w:type="table">
+  <w:style w:type="table" w:customStyle="1" w:styleId="Table">
     <w:name w:val="Table"/>
-    <w:basedOn w:val="TableNormal"/>
     <w:semiHidden/>
     <w:unhideWhenUsed/>
     <w:qFormat/>
     <w:tblPr>
-      <w:tblInd w:type="dxa" w:w="0"/>
+      <w:tblInd w:w="0" w:type="dxa"/>
       <w:tblCellMar>
-        <w:top w:type="dxa" w:w="0"/>
-        <w:left w:type="dxa" w:w="108"/>
-        <w:bottom w:type="dxa" w:w="0"/>
-        <w:right w:type="dxa" w:w="108"/>
+        <w:top w:w="0" w:type="dxa"/>
+        <w:left w:w="108" w:type="dxa"/>
+        <w:bottom w:w="0" w:type="dxa"/>
+        <w:right w:w="108" w:type="dxa"/>
       </w:tblCellMar>
     </w:tblPr>
     <w:tblStylePr w:type="firstRow">
+      <w:tblPr/>
       <w:tcPr>
         <w:tcBorders>
-          <w:bottom w:val="single"/>
+          <w:bottom w:val="single" w:sz="0" w:space="0" w:color="auto"/>
         </w:tcBorders>
         <w:vAlign w:val="bottom"/>
       </w:tcPr>
     </w:tblStylePr>
   </w:style>
-  <w:style w:customStyle="1" w:styleId="DefinitionTerm" w:type="paragraph">
+  <w:style w:type="paragraph" w:customStyle="1" w:styleId="DefinitionTerm">
     <w:name w:val="Definition Term"/>
     <w:basedOn w:val="Normal"/>
     <w:next w:val="Definition"/>
@@ -2499,75 +2715,76 @@
       <w:b/>
     </w:rPr>
   </w:style>
-  <w:style w:customStyle="1" w:styleId="Definition" w:type="paragraph">
+  <w:style w:type="paragraph" w:customStyle="1" w:styleId="Definition">
     <w:name w:val="Definition"/>
     <w:basedOn w:val="Normal"/>
   </w:style>
-  <w:style w:styleId="Caption" w:type="paragraph">
-    <w:name w:val="Caption"/>
+  <w:style w:type="paragraph" w:styleId="Caption">
+    <w:name w:val="caption"/>
     <w:basedOn w:val="Normal"/>
-    <w:link w:val="BodyTextChar"/>
+    <w:link w:val="CaptionChar"/>
     <w:pPr>
-      <w:spacing w:after="120" w:before="0"/>
+      <w:spacing w:after="120"/>
     </w:pPr>
     <w:rPr>
       <w:i/>
     </w:rPr>
   </w:style>
-  <w:style w:customStyle="1" w:styleId="TableCaption" w:type="paragraph">
+  <w:style w:type="paragraph" w:customStyle="1" w:styleId="TableCaption">
     <w:name w:val="Table Caption"/>
     <w:basedOn w:val="Caption"/>
     <w:pPr>
       <w:keepNext/>
     </w:pPr>
   </w:style>
-  <w:style w:customStyle="1" w:styleId="ImageCaption" w:type="paragraph">
+  <w:style w:type="paragraph" w:customStyle="1" w:styleId="ImageCaption">
     <w:name w:val="Image Caption"/>
     <w:basedOn w:val="Caption"/>
   </w:style>
-  <w:style w:customStyle="1" w:styleId="Figure" w:type="paragraph">
+  <w:style w:type="paragraph" w:customStyle="1" w:styleId="Figure">
     <w:name w:val="Figure"/>
     <w:basedOn w:val="Normal"/>
   </w:style>
-  <w:style w:customStyle="1" w:styleId="CaptionedFigure" w:type="paragraph">
+  <w:style w:type="paragraph" w:customStyle="1" w:styleId="CaptionedFigure">
     <w:name w:val="Captioned Figure"/>
     <w:basedOn w:val="Figure"/>
     <w:pPr>
       <w:keepNext/>
     </w:pPr>
   </w:style>
-  <w:style w:customStyle="1" w:styleId="BodyTextChar" w:type="character">
-    <w:name w:val="Body Text Char"/>
+  <w:style w:type="character" w:customStyle="1" w:styleId="CaptionChar">
+    <w:name w:val="Caption Char"/>
     <w:basedOn w:val="DefaultParagraphFont"/>
-    <w:link w:val="BodyText"/>
-  </w:style>
-  <w:style w:customStyle="1" w:styleId="VerbatimChar" w:type="character">
+    <w:link w:val="Caption"/>
+  </w:style>
+  <w:style w:type="character" w:customStyle="1" w:styleId="VerbatimChar">
     <w:name w:val="Verbatim Char"/>
-    <w:basedOn w:val="BodyTextChar"/>
+    <w:basedOn w:val="CaptionChar"/>
+    <w:link w:val="SourceCode"/>
     <w:rPr>
       <w:rFonts w:ascii="Consolas" w:hAnsi="Consolas"/>
       <w:sz w:val="22"/>
     </w:rPr>
   </w:style>
-  <w:style w:customStyle="1" w:styleId="SectionNumber" w:type="character">
+  <w:style w:type="character" w:customStyle="1" w:styleId="SectionNumber">
     <w:name w:val="Section Number"/>
-    <w:basedOn w:val="BodyTextChar"/>
-  </w:style>
-  <w:style w:styleId="FootnoteReference" w:type="character">
-    <w:name w:val="Footnote Reference"/>
-    <w:basedOn w:val="BodyTextChar"/>
+    <w:basedOn w:val="CaptionChar"/>
+  </w:style>
+  <w:style w:type="character" w:styleId="FootnoteReference">
+    <w:name w:val="footnote reference"/>
+    <w:basedOn w:val="CaptionChar"/>
     <w:rPr>
       <w:vertAlign w:val="superscript"/>
     </w:rPr>
   </w:style>
-  <w:style w:styleId="Hyperlink" w:type="character">
+  <w:style w:type="character" w:styleId="Hyperlink">
     <w:name w:val="Hyperlink"/>
-    <w:basedOn w:val="BodyTextChar"/>
-    <w:rPr>
-      <w:color w:themeColor="accent1" w:val="4F81BD"/>
-    </w:rPr>
-  </w:style>
-  <w:style w:styleId="TOCHeading" w:type="paragraph">
+    <w:basedOn w:val="CaptionChar"/>
+    <w:rPr>
+      <w:color w:val="156082" w:themeColor="accent1"/>
+    </w:rPr>
+  </w:style>
+  <w:style w:type="paragraph" w:styleId="TOCHeading">
     <w:name w:val="TOC Heading"/>
     <w:basedOn w:val="Heading1"/>
     <w:next w:val="BodyText"/>
@@ -2578,281 +2795,337 @@
       <w:spacing w:before="240" w:line="259" w:lineRule="auto"/>
       <w:outlineLvl w:val="9"/>
     </w:pPr>
-    <w:rPr>
-      <w:rFonts w:asciiTheme="majorHAnsi" w:cstheme="majorBidi" w:eastAsiaTheme="majorEastAsia" w:hAnsiTheme="majorHAnsi"/>
-      <w:b w:val="0"/>
-      <w:bCs w:val="0"/>
-      <w:color w:themeColor="accent1" w:themeShade="BF" w:val="365F91"/>
-    </w:rPr>
   </w:style>
   <w:style w:type="paragraph" w:customStyle="1" w:styleId="SourceCode">
     <w:name w:val="Source Code"/>
     <w:basedOn w:val="Normal"/>
     <w:link w:val="VerbatimChar"/>
     <w:pPr>
-      <w:wordWrap w:val="off"/>
-      <w:shd w:val="clear" w:fill="f8f8f8"/>
+      <w:shd w:val="clear" w:color="auto" w:fill="F8F8F8"/>
+      <w:wordWrap w:val="0"/>
     </w:pPr>
   </w:style>
   <w:style w:type="character" w:customStyle="1" w:styleId="KeywordTok">
     <w:name w:val="KeywordTok"/>
     <w:basedOn w:val="VerbatimChar"/>
     <w:rPr>
+      <w:rFonts w:ascii="Consolas" w:hAnsi="Consolas"/>
       <w:b/>
-      <w:color w:val="204a87"/>
-      <w:shd w:val="clear" w:fill="f8f8f8"/>
+      <w:color w:val="204A87"/>
+      <w:sz w:val="22"/>
+      <w:shd w:val="clear" w:color="auto" w:fill="F8F8F8"/>
     </w:rPr>
   </w:style>
   <w:style w:type="character" w:customStyle="1" w:styleId="DataTypeTok">
     <w:name w:val="DataTypeTok"/>
     <w:basedOn w:val="VerbatimChar"/>
     <w:rPr>
-      <w:color w:val="204a87"/>
-      <w:shd w:val="clear" w:fill="f8f8f8"/>
+      <w:rFonts w:ascii="Consolas" w:hAnsi="Consolas"/>
+      <w:color w:val="204A87"/>
+      <w:sz w:val="22"/>
+      <w:shd w:val="clear" w:color="auto" w:fill="F8F8F8"/>
     </w:rPr>
   </w:style>
   <w:style w:type="character" w:customStyle="1" w:styleId="DecValTok">
     <w:name w:val="DecValTok"/>
     <w:basedOn w:val="VerbatimChar"/>
     <w:rPr>
-      <w:color w:val="0000cf"/>
-      <w:shd w:val="clear" w:fill="f8f8f8"/>
+      <w:rFonts w:ascii="Consolas" w:hAnsi="Consolas"/>
+      <w:color w:val="0000CF"/>
+      <w:sz w:val="22"/>
+      <w:shd w:val="clear" w:color="auto" w:fill="F8F8F8"/>
     </w:rPr>
   </w:style>
   <w:style w:type="character" w:customStyle="1" w:styleId="BaseNTok">
     <w:name w:val="BaseNTok"/>
     <w:basedOn w:val="VerbatimChar"/>
     <w:rPr>
-      <w:color w:val="0000cf"/>
-      <w:shd w:val="clear" w:fill="f8f8f8"/>
+      <w:rFonts w:ascii="Consolas" w:hAnsi="Consolas"/>
+      <w:color w:val="0000CF"/>
+      <w:sz w:val="22"/>
+      <w:shd w:val="clear" w:color="auto" w:fill="F8F8F8"/>
     </w:rPr>
   </w:style>
   <w:style w:type="character" w:customStyle="1" w:styleId="FloatTok">
     <w:name w:val="FloatTok"/>
     <w:basedOn w:val="VerbatimChar"/>
     <w:rPr>
-      <w:color w:val="0000cf"/>
-      <w:shd w:val="clear" w:fill="f8f8f8"/>
+      <w:rFonts w:ascii="Consolas" w:hAnsi="Consolas"/>
+      <w:color w:val="0000CF"/>
+      <w:sz w:val="22"/>
+      <w:shd w:val="clear" w:color="auto" w:fill="F8F8F8"/>
     </w:rPr>
   </w:style>
   <w:style w:type="character" w:customStyle="1" w:styleId="ConstantTok">
     <w:name w:val="ConstantTok"/>
     <w:basedOn w:val="VerbatimChar"/>
     <w:rPr>
-      <w:color w:val="8f5902"/>
-      <w:shd w:val="clear" w:fill="f8f8f8"/>
+      <w:rFonts w:ascii="Consolas" w:hAnsi="Consolas"/>
+      <w:color w:val="8F5902"/>
+      <w:sz w:val="22"/>
+      <w:shd w:val="clear" w:color="auto" w:fill="F8F8F8"/>
     </w:rPr>
   </w:style>
   <w:style w:type="character" w:customStyle="1" w:styleId="CharTok">
     <w:name w:val="CharTok"/>
     <w:basedOn w:val="VerbatimChar"/>
     <w:rPr>
-      <w:color w:val="4e9a06"/>
-      <w:shd w:val="clear" w:fill="f8f8f8"/>
+      <w:rFonts w:ascii="Consolas" w:hAnsi="Consolas"/>
+      <w:color w:val="4E9A06"/>
+      <w:sz w:val="22"/>
+      <w:shd w:val="clear" w:color="auto" w:fill="F8F8F8"/>
     </w:rPr>
   </w:style>
   <w:style w:type="character" w:customStyle="1" w:styleId="SpecialCharTok">
     <w:name w:val="SpecialCharTok"/>
     <w:basedOn w:val="VerbatimChar"/>
     <w:rPr>
+      <w:rFonts w:ascii="Consolas" w:hAnsi="Consolas"/>
       <w:b/>
-      <w:color w:val="ce5c00"/>
-      <w:shd w:val="clear" w:fill="f8f8f8"/>
+      <w:color w:val="CE5C00"/>
+      <w:sz w:val="22"/>
+      <w:shd w:val="clear" w:color="auto" w:fill="F8F8F8"/>
     </w:rPr>
   </w:style>
   <w:style w:type="character" w:customStyle="1" w:styleId="StringTok">
     <w:name w:val="StringTok"/>
     <w:basedOn w:val="VerbatimChar"/>
     <w:rPr>
-      <w:color w:val="4e9a06"/>
-      <w:shd w:val="clear" w:fill="f8f8f8"/>
+      <w:rFonts w:ascii="Consolas" w:hAnsi="Consolas"/>
+      <w:color w:val="4E9A06"/>
+      <w:sz w:val="22"/>
+      <w:shd w:val="clear" w:color="auto" w:fill="F8F8F8"/>
     </w:rPr>
   </w:style>
   <w:style w:type="character" w:customStyle="1" w:styleId="VerbatimStringTok">
     <w:name w:val="VerbatimStringTok"/>
     <w:basedOn w:val="VerbatimChar"/>
     <w:rPr>
-      <w:color w:val="4e9a06"/>
-      <w:shd w:val="clear" w:fill="f8f8f8"/>
+      <w:rFonts w:ascii="Consolas" w:hAnsi="Consolas"/>
+      <w:color w:val="4E9A06"/>
+      <w:sz w:val="22"/>
+      <w:shd w:val="clear" w:color="auto" w:fill="F8F8F8"/>
     </w:rPr>
   </w:style>
   <w:style w:type="character" w:customStyle="1" w:styleId="SpecialStringTok">
     <w:name w:val="SpecialStringTok"/>
     <w:basedOn w:val="VerbatimChar"/>
     <w:rPr>
-      <w:color w:val="4e9a06"/>
-      <w:shd w:val="clear" w:fill="f8f8f8"/>
+      <w:rFonts w:ascii="Consolas" w:hAnsi="Consolas"/>
+      <w:color w:val="4E9A06"/>
+      <w:sz w:val="22"/>
+      <w:shd w:val="clear" w:color="auto" w:fill="F8F8F8"/>
     </w:rPr>
   </w:style>
   <w:style w:type="character" w:customStyle="1" w:styleId="ImportTok">
     <w:name w:val="ImportTok"/>
     <w:basedOn w:val="VerbatimChar"/>
     <w:rPr>
-      <w:shd w:val="clear" w:fill="f8f8f8"/>
+      <w:rFonts w:ascii="Consolas" w:hAnsi="Consolas"/>
+      <w:sz w:val="22"/>
+      <w:shd w:val="clear" w:color="auto" w:fill="F8F8F8"/>
     </w:rPr>
   </w:style>
   <w:style w:type="character" w:customStyle="1" w:styleId="CommentTok">
     <w:name w:val="CommentTok"/>
     <w:basedOn w:val="VerbatimChar"/>
     <w:rPr>
+      <w:rFonts w:ascii="Consolas" w:hAnsi="Consolas"/>
       <w:i/>
-      <w:color w:val="8f5902"/>
-      <w:shd w:val="clear" w:fill="f8f8f8"/>
+      <w:color w:val="8F5902"/>
+      <w:sz w:val="22"/>
+      <w:shd w:val="clear" w:color="auto" w:fill="F8F8F8"/>
     </w:rPr>
   </w:style>
   <w:style w:type="character" w:customStyle="1" w:styleId="DocumentationTok">
     <w:name w:val="DocumentationTok"/>
     <w:basedOn w:val="VerbatimChar"/>
     <w:rPr>
+      <w:rFonts w:ascii="Consolas" w:hAnsi="Consolas"/>
       <w:b/>
       <w:i/>
-      <w:color w:val="8f5902"/>
-      <w:shd w:val="clear" w:fill="f8f8f8"/>
+      <w:color w:val="8F5902"/>
+      <w:sz w:val="22"/>
+      <w:shd w:val="clear" w:color="auto" w:fill="F8F8F8"/>
     </w:rPr>
   </w:style>
   <w:style w:type="character" w:customStyle="1" w:styleId="AnnotationTok">
     <w:name w:val="AnnotationTok"/>
     <w:basedOn w:val="VerbatimChar"/>
     <w:rPr>
+      <w:rFonts w:ascii="Consolas" w:hAnsi="Consolas"/>
       <w:b/>
       <w:i/>
-      <w:color w:val="8f5902"/>
-      <w:shd w:val="clear" w:fill="f8f8f8"/>
+      <w:color w:val="8F5902"/>
+      <w:sz w:val="22"/>
+      <w:shd w:val="clear" w:color="auto" w:fill="F8F8F8"/>
     </w:rPr>
   </w:style>
   <w:style w:type="character" w:customStyle="1" w:styleId="CommentVarTok">
     <w:name w:val="CommentVarTok"/>
     <w:basedOn w:val="VerbatimChar"/>
     <w:rPr>
+      <w:rFonts w:ascii="Consolas" w:hAnsi="Consolas"/>
       <w:b/>
       <w:i/>
-      <w:color w:val="8f5902"/>
-      <w:shd w:val="clear" w:fill="f8f8f8"/>
+      <w:color w:val="8F5902"/>
+      <w:sz w:val="22"/>
+      <w:shd w:val="clear" w:color="auto" w:fill="F8F8F8"/>
     </w:rPr>
   </w:style>
   <w:style w:type="character" w:customStyle="1" w:styleId="OtherTok">
     <w:name w:val="OtherTok"/>
     <w:basedOn w:val="VerbatimChar"/>
     <w:rPr>
-      <w:color w:val="8f5902"/>
-      <w:shd w:val="clear" w:fill="f8f8f8"/>
+      <w:rFonts w:ascii="Consolas" w:hAnsi="Consolas"/>
+      <w:color w:val="8F5902"/>
+      <w:sz w:val="22"/>
+      <w:shd w:val="clear" w:color="auto" w:fill="F8F8F8"/>
     </w:rPr>
   </w:style>
   <w:style w:type="character" w:customStyle="1" w:styleId="FunctionTok">
     <w:name w:val="FunctionTok"/>
     <w:basedOn w:val="VerbatimChar"/>
     <w:rPr>
+      <w:rFonts w:ascii="Consolas" w:hAnsi="Consolas"/>
       <w:b/>
-      <w:color w:val="204a87"/>
-      <w:shd w:val="clear" w:fill="f8f8f8"/>
+      <w:color w:val="204A87"/>
+      <w:sz w:val="22"/>
+      <w:shd w:val="clear" w:color="auto" w:fill="F8F8F8"/>
     </w:rPr>
   </w:style>
   <w:style w:type="character" w:customStyle="1" w:styleId="VariableTok">
     <w:name w:val="VariableTok"/>
     <w:basedOn w:val="VerbatimChar"/>
     <w:rPr>
+      <w:rFonts w:ascii="Consolas" w:hAnsi="Consolas"/>
       <w:color w:val="000000"/>
-      <w:shd w:val="clear" w:fill="f8f8f8"/>
+      <w:sz w:val="22"/>
+      <w:shd w:val="clear" w:color="auto" w:fill="F8F8F8"/>
     </w:rPr>
   </w:style>
   <w:style w:type="character" w:customStyle="1" w:styleId="ControlFlowTok">
     <w:name w:val="ControlFlowTok"/>
     <w:basedOn w:val="VerbatimChar"/>
     <w:rPr>
+      <w:rFonts w:ascii="Consolas" w:hAnsi="Consolas"/>
       <w:b/>
-      <w:color w:val="204a87"/>
-      <w:shd w:val="clear" w:fill="f8f8f8"/>
+      <w:color w:val="204A87"/>
+      <w:sz w:val="22"/>
+      <w:shd w:val="clear" w:color="auto" w:fill="F8F8F8"/>
     </w:rPr>
   </w:style>
   <w:style w:type="character" w:customStyle="1" w:styleId="OperatorTok">
     <w:name w:val="OperatorTok"/>
     <w:basedOn w:val="VerbatimChar"/>
     <w:rPr>
+      <w:rFonts w:ascii="Consolas" w:hAnsi="Consolas"/>
       <w:b/>
-      <w:color w:val="ce5c00"/>
-      <w:shd w:val="clear" w:fill="f8f8f8"/>
+      <w:color w:val="CE5C00"/>
+      <w:sz w:val="22"/>
+      <w:shd w:val="clear" w:color="auto" w:fill="F8F8F8"/>
     </w:rPr>
   </w:style>
   <w:style w:type="character" w:customStyle="1" w:styleId="BuiltInTok">
     <w:name w:val="BuiltInTok"/>
     <w:basedOn w:val="VerbatimChar"/>
     <w:rPr>
-      <w:shd w:val="clear" w:fill="f8f8f8"/>
+      <w:rFonts w:ascii="Consolas" w:hAnsi="Consolas"/>
+      <w:sz w:val="22"/>
+      <w:shd w:val="clear" w:color="auto" w:fill="F8F8F8"/>
     </w:rPr>
   </w:style>
   <w:style w:type="character" w:customStyle="1" w:styleId="ExtensionTok">
     <w:name w:val="ExtensionTok"/>
     <w:basedOn w:val="VerbatimChar"/>
     <w:rPr>
-      <w:shd w:val="clear" w:fill="f8f8f8"/>
+      <w:rFonts w:ascii="Consolas" w:hAnsi="Consolas"/>
+      <w:sz w:val="22"/>
+      <w:shd w:val="clear" w:color="auto" w:fill="F8F8F8"/>
     </w:rPr>
   </w:style>
   <w:style w:type="character" w:customStyle="1" w:styleId="PreprocessorTok">
     <w:name w:val="PreprocessorTok"/>
     <w:basedOn w:val="VerbatimChar"/>
     <w:rPr>
+      <w:rFonts w:ascii="Consolas" w:hAnsi="Consolas"/>
       <w:i/>
-      <w:color w:val="8f5902"/>
-      <w:shd w:val="clear" w:fill="f8f8f8"/>
+      <w:color w:val="8F5902"/>
+      <w:sz w:val="22"/>
+      <w:shd w:val="clear" w:color="auto" w:fill="F8F8F8"/>
     </w:rPr>
   </w:style>
   <w:style w:type="character" w:customStyle="1" w:styleId="AttributeTok">
     <w:name w:val="AttributeTok"/>
     <w:basedOn w:val="VerbatimChar"/>
     <w:rPr>
-      <w:color w:val="204a87"/>
-      <w:shd w:val="clear" w:fill="f8f8f8"/>
+      <w:rFonts w:ascii="Consolas" w:hAnsi="Consolas"/>
+      <w:color w:val="204A87"/>
+      <w:sz w:val="22"/>
+      <w:shd w:val="clear" w:color="auto" w:fill="F8F8F8"/>
     </w:rPr>
   </w:style>
   <w:style w:type="character" w:customStyle="1" w:styleId="RegionMarkerTok">
     <w:name w:val="RegionMarkerTok"/>
     <w:basedOn w:val="VerbatimChar"/>
     <w:rPr>
-      <w:shd w:val="clear" w:fill="f8f8f8"/>
+      <w:rFonts w:ascii="Consolas" w:hAnsi="Consolas"/>
+      <w:sz w:val="22"/>
+      <w:shd w:val="clear" w:color="auto" w:fill="F8F8F8"/>
     </w:rPr>
   </w:style>
   <w:style w:type="character" w:customStyle="1" w:styleId="InformationTok">
     <w:name w:val="InformationTok"/>
     <w:basedOn w:val="VerbatimChar"/>
     <w:rPr>
+      <w:rFonts w:ascii="Consolas" w:hAnsi="Consolas"/>
       <w:b/>
       <w:i/>
-      <w:color w:val="8f5902"/>
-      <w:shd w:val="clear" w:fill="f8f8f8"/>
+      <w:color w:val="8F5902"/>
+      <w:sz w:val="22"/>
+      <w:shd w:val="clear" w:color="auto" w:fill="F8F8F8"/>
     </w:rPr>
   </w:style>
   <w:style w:type="character" w:customStyle="1" w:styleId="WarningTok">
     <w:name w:val="WarningTok"/>
     <w:basedOn w:val="VerbatimChar"/>
     <w:rPr>
+      <w:rFonts w:ascii="Consolas" w:hAnsi="Consolas"/>
       <w:b/>
       <w:i/>
-      <w:color w:val="8f5902"/>
-      <w:shd w:val="clear" w:fill="f8f8f8"/>
+      <w:color w:val="8F5902"/>
+      <w:sz w:val="22"/>
+      <w:shd w:val="clear" w:color="auto" w:fill="F8F8F8"/>
     </w:rPr>
   </w:style>
   <w:style w:type="character" w:customStyle="1" w:styleId="AlertTok">
     <w:name w:val="AlertTok"/>
     <w:basedOn w:val="VerbatimChar"/>
     <w:rPr>
-      <w:color w:val="ef2929"/>
-      <w:shd w:val="clear" w:fill="f8f8f8"/>
+      <w:rFonts w:ascii="Consolas" w:hAnsi="Consolas"/>
+      <w:color w:val="EF2929"/>
+      <w:sz w:val="22"/>
+      <w:shd w:val="clear" w:color="auto" w:fill="F8F8F8"/>
     </w:rPr>
   </w:style>
   <w:style w:type="character" w:customStyle="1" w:styleId="ErrorTok">
     <w:name w:val="ErrorTok"/>
     <w:basedOn w:val="VerbatimChar"/>
     <w:rPr>
+      <w:rFonts w:ascii="Consolas" w:hAnsi="Consolas"/>
       <w:b/>
-      <w:color w:val="a40000"/>
-      <w:shd w:val="clear" w:fill="f8f8f8"/>
+      <w:color w:val="A40000"/>
+      <w:sz w:val="22"/>
+      <w:shd w:val="clear" w:color="auto" w:fill="F8F8F8"/>
     </w:rPr>
   </w:style>
   <w:style w:type="character" w:customStyle="1" w:styleId="NormalTok">
     <w:name w:val="NormalTok"/>
     <w:basedOn w:val="VerbatimChar"/>
     <w:rPr>
-      <w:shd w:val="clear" w:fill="f8f8f8"/>
+      <w:rFonts w:ascii="Consolas" w:hAnsi="Consolas"/>
+      <w:sz w:val="22"/>
+      <w:shd w:val="clear" w:color="auto" w:fill="F8F8F8"/>
     </w:rPr>
   </w:style>
 </w:styles>

</xml_diff>